<commit_message>
feat: Complete initial version of the AiAutomation pipeline
</commit_message>
<xml_diff>
--- a/Resume.docx
+++ b/Resume.docx
@@ -102,12 +102,21 @@
           <w:sz w:val="22"/>
           <w:szCs w:val="22"/>
         </w:rPr>
+        <w:t xml:space="preserve"> </w:t>
+      </w:r>
+      <w:r>
+        <w:rPr>
+          <w:rFonts w:ascii="Times New Roman" w:hAnsi="Times New Roman" w:eastAsia="Times New Roman" w:cs="Times New Roman"/>
+          <w:color w:val="262626" w:themeColor="text1" w:themeTint="D9"/>
+          <w:sz w:val="22"/>
+          <w:szCs w:val="22"/>
+        </w:rPr>
         <w:t xml:space="preserve">| </w:t>
       </w:r>
       <w:hyperlink r:id="rId9" w:tooltip="https://www.linkedin.com/in/bitan-banerjee/" w:history="1">
         <w:r>
           <w:rPr>
-            <w:rStyle w:val="857"/>
+            <w:rStyle w:val="859"/>
             <w:rFonts w:ascii="Times New Roman" w:hAnsi="Times New Roman" w:eastAsia="Times New Roman" w:cs="Times New Roman"/>
             <w:color w:val="262626" w:themeColor="text1" w:themeTint="D9"/>
             <w:sz w:val="22"/>
@@ -118,7 +127,7 @@
       </w:hyperlink>
       <w:r>
         <w:rPr>
-          <w:rStyle w:val="857"/>
+          <w:rStyle w:val="859"/>
           <w:rFonts w:ascii="Times New Roman" w:hAnsi="Times New Roman" w:eastAsia="Times New Roman" w:cs="Times New Roman"/>
           <w:color w:val="262626" w:themeColor="text1" w:themeTint="D9"/>
           <w:sz w:val="22"/>
@@ -148,7 +157,7 @@
       <w:hyperlink r:id="rId10" w:tooltip="https://github.com/Bitan-Banerjee" w:history="1">
         <w:r>
           <w:rPr>
-            <w:rStyle w:val="857"/>
+            <w:rStyle w:val="859"/>
             <w:rFonts w:ascii="Times New Roman" w:hAnsi="Times New Roman" w:eastAsia="Times New Roman" w:cs="Times New Roman"/>
             <w:color w:val="262626" w:themeColor="text1" w:themeTint="D9"/>
             <w:sz w:val="22"/>
@@ -159,15 +168,45 @@
       </w:hyperlink>
       <w:r>
         <w:rPr>
-          <w:rStyle w:val="857"/>
+          <w:rStyle w:val="859"/>
           <w:rFonts w:ascii="Times New Roman" w:hAnsi="Times New Roman" w:eastAsia="Times New Roman" w:cs="Times New Roman"/>
           <w:color w:val="262626" w:themeColor="text1" w:themeTint="D9"/>
           <w:sz w:val="22"/>
           <w:szCs w:val="22"/>
           <w:u w:val="none"/>
         </w:rPr>
-        <w:t xml:space="preserve"> </w:t>
+        <w:t xml:space="preserve"> | </w:t>
       </w:r>
+      <w:hyperlink r:id="rId11" w:tooltip="https://bitan-banerjee.github.io/Bitan-Banerjee/" w:history="1">
+        <w:r>
+          <w:rPr>
+            <w:rStyle w:val="859"/>
+            <w:rFonts w:ascii="Times New Roman" w:hAnsi="Times New Roman" w:eastAsia="Times New Roman" w:cs="Times New Roman"/>
+            <w:color w:val="262626" w:themeColor="text1" w:themeTint="D9"/>
+            <w:sz w:val="22"/>
+            <w:szCs w:val="22"/>
+          </w:rPr>
+          <w:t xml:space="preserve">Website</w:t>
+        </w:r>
+        <w:r>
+          <w:rPr>
+            <w:rStyle w:val="859"/>
+            <w:rFonts w:ascii="Times New Roman" w:hAnsi="Times New Roman" w:cs="Times New Roman"/>
+            <w:color w:val="262626" w:themeColor="text1" w:themeTint="D9"/>
+            <w:sz w:val="22"/>
+            <w:szCs w:val="22"/>
+          </w:rPr>
+        </w:r>
+        <w:r>
+          <w:rPr>
+            <w:rStyle w:val="859"/>
+            <w:rFonts w:ascii="Times New Roman" w:hAnsi="Times New Roman" w:cs="Times New Roman"/>
+            <w:color w:val="262626" w:themeColor="text1" w:themeTint="D9"/>
+            <w:sz w:val="22"/>
+            <w:szCs w:val="22"/>
+          </w:rPr>
+        </w:r>
+      </w:hyperlink>
       <w:r>
         <w:rPr>
           <w:rFonts w:ascii="Times New Roman" w:hAnsi="Times New Roman" w:cs="Times New Roman"/>
@@ -297,7 +336,38 @@
           <w:sz w:val="18"/>
           <w:szCs w:val="16"/>
         </w:rPr>
-        <w:t xml:space="preserve">Data Engineer with 3.8 years of experience designing and modernizing complex data ecosystems in </w:t>
+        <w:t xml:space="preserve">Data Engineer with </w:t>
+      </w:r>
+      <w:r>
+        <w:rPr>
+          <w:rFonts w:ascii="Times New Roman" w:hAnsi="Times New Roman" w:eastAsia="Times New Roman" w:cs="Times New Roman"/>
+          <w:b w:val="0"/>
+          <w:bCs w:val="0"/>
+          <w:color w:val="000000"/>
+          <w:sz w:val="18"/>
+          <w:szCs w:val="16"/>
+        </w:rPr>
+        <w:t xml:space="preserve">around </w:t>
+      </w:r>
+      <w:r>
+        <w:rPr>
+          <w:rFonts w:ascii="Times New Roman" w:hAnsi="Times New Roman" w:eastAsia="Times New Roman" w:cs="Times New Roman"/>
+          <w:b/>
+          <w:bCs/>
+          <w:color w:val="000000"/>
+          <w:sz w:val="18"/>
+          <w:szCs w:val="16"/>
+        </w:rPr>
+        <w:t xml:space="preserve">4+ years</w:t>
+      </w:r>
+      <w:r>
+        <w:rPr>
+          <w:rFonts w:ascii="Times New Roman" w:hAnsi="Times New Roman" w:eastAsia="Times New Roman" w:cs="Times New Roman"/>
+          <w:color w:val="000000"/>
+          <w:sz w:val="18"/>
+          <w:szCs w:val="16"/>
+        </w:rPr>
+        <w:t xml:space="preserve"> of experience designing and modernizing complex data ecosystems in </w:t>
       </w:r>
       <w:r>
         <w:rPr>
@@ -498,7 +568,7 @@
     </w:p>
     <w:tbl>
       <w:tblPr>
-        <w:tblStyle w:val="686"/>
+        <w:tblStyle w:val="688"/>
         <w:tblW w:w="0" w:type="auto"/>
         <w:tblInd w:w="-992" w:type="dxa"/>
         <w:tblBorders>
@@ -1583,7 +1653,7 @@
     </w:p>
     <w:p>
       <w:pPr>
-        <w:pStyle w:val="815"/>
+        <w:pStyle w:val="817"/>
         <w:pBdr>
           <w:top w:val="none" w:color="000000" w:sz="4" w:space="0"/>
           <w:left w:val="none" w:color="000000" w:sz="4" w:space="0"/>
@@ -1685,6 +1755,11 @@
     </w:p>
     <w:p>
       <w:pPr>
+        <w:pStyle w:val="867"/>
+        <w:numPr>
+          <w:ilvl w:val="0"/>
+          <w:numId w:val="11"/>
+        </w:numPr>
         <w:pBdr>
           <w:top w:val="none" w:color="000000" w:sz="4" w:space="0"/>
           <w:left w:val="none" w:color="000000" w:sz="4" w:space="0"/>
@@ -1692,7 +1767,7 @@
           <w:right w:val="none" w:color="000000" w:sz="4" w:space="0"/>
         </w:pBdr>
         <w:spacing w:after="0"/>
-        <w:ind w:right="0" w:firstLine="0" w:left="-992"/>
+        <w:ind w:right="0" w:hanging="142" w:left="-850"/>
         <w:rPr>
           <w:rFonts w:ascii="Times New Roman" w:hAnsi="Times New Roman" w:cs="Times New Roman"/>
           <w:sz w:val="18"/>
@@ -1725,7 +1800,7 @@
     </w:p>
     <w:p>
       <w:pPr>
-        <w:pStyle w:val="865"/>
+        <w:pStyle w:val="867"/>
         <w:numPr>
           <w:ilvl w:val="0"/>
           <w:numId w:val="7"/>
@@ -1808,7 +1883,7 @@
     </w:p>
     <w:p>
       <w:pPr>
-        <w:pStyle w:val="865"/>
+        <w:pStyle w:val="867"/>
         <w:numPr>
           <w:ilvl w:val="0"/>
           <w:numId w:val="7"/>
@@ -1891,7 +1966,7 @@
     </w:p>
     <w:p>
       <w:pPr>
-        <w:pStyle w:val="865"/>
+        <w:pStyle w:val="867"/>
         <w:numPr>
           <w:ilvl w:val="0"/>
           <w:numId w:val="7"/>
@@ -1936,7 +2011,7 @@
     </w:p>
     <w:p>
       <w:pPr>
-        <w:pStyle w:val="865"/>
+        <w:pStyle w:val="867"/>
         <w:numPr>
           <w:ilvl w:val="0"/>
           <w:numId w:val="7"/>
@@ -2000,7 +2075,7 @@
     </w:p>
     <w:p>
       <w:pPr>
-        <w:pStyle w:val="865"/>
+        <w:pStyle w:val="867"/>
         <w:numPr>
           <w:ilvl w:val="0"/>
           <w:numId w:val="7"/>
@@ -2083,7 +2158,7 @@
     </w:p>
     <w:p>
       <w:pPr>
-        <w:pStyle w:val="865"/>
+        <w:pStyle w:val="867"/>
         <w:numPr>
           <w:ilvl w:val="0"/>
           <w:numId w:val="7"/>
@@ -2147,7 +2222,7 @@
     </w:p>
     <w:p>
       <w:pPr>
-        <w:pStyle w:val="865"/>
+        <w:pStyle w:val="867"/>
         <w:numPr>
           <w:ilvl w:val="0"/>
           <w:numId w:val="7"/>
@@ -2249,7 +2324,7 @@
     </w:p>
     <w:p>
       <w:pPr>
-        <w:pStyle w:val="865"/>
+        <w:pStyle w:val="867"/>
         <w:numPr>
           <w:ilvl w:val="0"/>
           <w:numId w:val="7"/>
@@ -2294,7 +2369,7 @@
     </w:p>
     <w:p>
       <w:pPr>
-        <w:pStyle w:val="815"/>
+        <w:pStyle w:val="817"/>
         <w:pBdr>
           <w:top w:val="none" w:color="000000" w:sz="4" w:space="0"/>
           <w:left w:val="none" w:color="000000" w:sz="4" w:space="0"/>
@@ -2396,7 +2471,7 @@
     </w:p>
     <w:p>
       <w:pPr>
-        <w:pStyle w:val="865"/>
+        <w:pStyle w:val="867"/>
         <w:numPr>
           <w:ilvl w:val="0"/>
           <w:numId w:val="8"/>
@@ -2460,7 +2535,7 @@
     </w:p>
     <w:p>
       <w:pPr>
-        <w:pStyle w:val="865"/>
+        <w:pStyle w:val="867"/>
         <w:numPr>
           <w:ilvl w:val="0"/>
           <w:numId w:val="8"/>
@@ -2560,7 +2635,7 @@
     </w:p>
     <w:p>
       <w:pPr>
-        <w:pStyle w:val="865"/>
+        <w:pStyle w:val="867"/>
         <w:numPr>
           <w:ilvl w:val="0"/>
           <w:numId w:val="8"/>
@@ -2624,7 +2699,7 @@
     </w:p>
     <w:p>
       <w:pPr>
-        <w:pStyle w:val="865"/>
+        <w:pStyle w:val="867"/>
         <w:numPr>
           <w:ilvl w:val="0"/>
           <w:numId w:val="8"/>
@@ -2688,7 +2763,7 @@
     </w:p>
     <w:p>
       <w:pPr>
-        <w:pStyle w:val="865"/>
+        <w:pStyle w:val="867"/>
         <w:pBdr/>
         <w:spacing/>
         <w:ind w:right="0" w:firstLine="0" w:left="0"/>
@@ -2774,7 +2849,7 @@
     </w:p>
     <w:p>
       <w:pPr>
-        <w:pStyle w:val="865"/>
+        <w:pStyle w:val="867"/>
         <w:numPr>
           <w:ilvl w:val="0"/>
           <w:numId w:val="5"/>
@@ -2818,7 +2893,7 @@
     </w:p>
     <w:p>
       <w:pPr>
-        <w:pStyle w:val="865"/>
+        <w:pStyle w:val="867"/>
         <w:numPr>
           <w:ilvl w:val="0"/>
           <w:numId w:val="5"/>
@@ -2910,7 +2985,7 @@
     </w:p>
     <w:p>
       <w:pPr>
-        <w:pStyle w:val="865"/>
+        <w:pStyle w:val="867"/>
         <w:numPr>
           <w:ilvl w:val="0"/>
           <w:numId w:val="5"/>
@@ -3116,7 +3191,7 @@
     </w:p>
     <w:p>
       <w:pPr>
-        <w:pStyle w:val="865"/>
+        <w:pStyle w:val="867"/>
         <w:numPr>
           <w:ilvl w:val="0"/>
           <w:numId w:val="10"/>
@@ -4759,6 +4834,152 @@
       </w:pPr>
       <w:rPr>
         <w:rFonts w:hint="default" w:ascii="Symbol" w:hAnsi="Symbol" w:eastAsia="Symbol" w:cs="Symbol"/>
+      </w:rPr>
+      <w:start w:val="1"/>
+      <w:suff w:val="tab"/>
+    </w:lvl>
+  </w:abstractNum>
+  <w:abstractNum w:abstractNumId="10">
+    <w:lvl w:ilvl="0">
+      <w:isLgl w:val="false"/>
+      <w:lvlJc w:val="left"/>
+      <w:lvlText w:val="·"/>
+      <w:numFmt w:val="bullet"/>
+      <w:pPr>
+        <w:pBdr/>
+        <w:spacing/>
+        <w:ind w:hanging="360" w:left="-283"/>
+      </w:pPr>
+      <w:rPr>
+        <w:rFonts w:hint="default" w:ascii="Symbol" w:hAnsi="Symbol" w:eastAsia="Symbol" w:cs="Symbol"/>
+      </w:rPr>
+      <w:start w:val="1"/>
+      <w:suff w:val="tab"/>
+    </w:lvl>
+    <w:lvl w:ilvl="1">
+      <w:isLgl w:val="false"/>
+      <w:lvlJc w:val="left"/>
+      <w:lvlText w:val="o"/>
+      <w:numFmt w:val="bullet"/>
+      <w:pPr>
+        <w:pBdr/>
+        <w:spacing/>
+        <w:ind w:hanging="360" w:left="437"/>
+      </w:pPr>
+      <w:rPr>
+        <w:rFonts w:hint="default" w:ascii="Courier New" w:hAnsi="Courier New" w:eastAsia="Courier New" w:cs="Courier New"/>
+      </w:rPr>
+      <w:start w:val="1"/>
+      <w:suff w:val="tab"/>
+    </w:lvl>
+    <w:lvl w:ilvl="2">
+      <w:isLgl w:val="false"/>
+      <w:lvlJc w:val="left"/>
+      <w:lvlText w:val="§"/>
+      <w:numFmt w:val="bullet"/>
+      <w:pPr>
+        <w:pBdr/>
+        <w:spacing/>
+        <w:ind w:hanging="360" w:left="1157"/>
+      </w:pPr>
+      <w:rPr>
+        <w:rFonts w:hint="default" w:ascii="Wingdings" w:hAnsi="Wingdings" w:eastAsia="Wingdings" w:cs="Wingdings"/>
+      </w:rPr>
+      <w:start w:val="1"/>
+      <w:suff w:val="tab"/>
+    </w:lvl>
+    <w:lvl w:ilvl="3">
+      <w:isLgl w:val="false"/>
+      <w:lvlJc w:val="left"/>
+      <w:lvlText w:val="·"/>
+      <w:numFmt w:val="bullet"/>
+      <w:pPr>
+        <w:pBdr/>
+        <w:spacing/>
+        <w:ind w:hanging="360" w:left="1877"/>
+      </w:pPr>
+      <w:rPr>
+        <w:rFonts w:hint="default" w:ascii="Symbol" w:hAnsi="Symbol" w:eastAsia="Symbol" w:cs="Symbol"/>
+      </w:rPr>
+      <w:start w:val="1"/>
+      <w:suff w:val="tab"/>
+    </w:lvl>
+    <w:lvl w:ilvl="4">
+      <w:isLgl w:val="false"/>
+      <w:lvlJc w:val="left"/>
+      <w:lvlText w:val="o"/>
+      <w:numFmt w:val="bullet"/>
+      <w:pPr>
+        <w:pBdr/>
+        <w:spacing/>
+        <w:ind w:hanging="360" w:left="2597"/>
+      </w:pPr>
+      <w:rPr>
+        <w:rFonts w:hint="default" w:ascii="Courier New" w:hAnsi="Courier New" w:eastAsia="Courier New" w:cs="Courier New"/>
+      </w:rPr>
+      <w:start w:val="1"/>
+      <w:suff w:val="tab"/>
+    </w:lvl>
+    <w:lvl w:ilvl="5">
+      <w:isLgl w:val="false"/>
+      <w:lvlJc w:val="left"/>
+      <w:lvlText w:val="§"/>
+      <w:numFmt w:val="bullet"/>
+      <w:pPr>
+        <w:pBdr/>
+        <w:spacing/>
+        <w:ind w:hanging="360" w:left="3317"/>
+      </w:pPr>
+      <w:rPr>
+        <w:rFonts w:hint="default" w:ascii="Wingdings" w:hAnsi="Wingdings" w:eastAsia="Wingdings" w:cs="Wingdings"/>
+      </w:rPr>
+      <w:start w:val="1"/>
+      <w:suff w:val="tab"/>
+    </w:lvl>
+    <w:lvl w:ilvl="6">
+      <w:isLgl w:val="false"/>
+      <w:lvlJc w:val="left"/>
+      <w:lvlText w:val="·"/>
+      <w:numFmt w:val="bullet"/>
+      <w:pPr>
+        <w:pBdr/>
+        <w:spacing/>
+        <w:ind w:hanging="360" w:left="4037"/>
+      </w:pPr>
+      <w:rPr>
+        <w:rFonts w:hint="default" w:ascii="Symbol" w:hAnsi="Symbol" w:eastAsia="Symbol" w:cs="Symbol"/>
+      </w:rPr>
+      <w:start w:val="1"/>
+      <w:suff w:val="tab"/>
+    </w:lvl>
+    <w:lvl w:ilvl="7">
+      <w:isLgl w:val="false"/>
+      <w:lvlJc w:val="left"/>
+      <w:lvlText w:val="o"/>
+      <w:numFmt w:val="bullet"/>
+      <w:pPr>
+        <w:pBdr/>
+        <w:spacing/>
+        <w:ind w:hanging="360" w:left="4757"/>
+      </w:pPr>
+      <w:rPr>
+        <w:rFonts w:hint="default" w:ascii="Courier New" w:hAnsi="Courier New" w:eastAsia="Courier New" w:cs="Courier New"/>
+      </w:rPr>
+      <w:start w:val="1"/>
+      <w:suff w:val="tab"/>
+    </w:lvl>
+    <w:lvl w:ilvl="8">
+      <w:isLgl w:val="false"/>
+      <w:lvlJc w:val="left"/>
+      <w:lvlText w:val="§"/>
+      <w:numFmt w:val="bullet"/>
+      <w:pPr>
+        <w:pBdr/>
+        <w:spacing/>
+        <w:ind w:hanging="360" w:left="5477"/>
+      </w:pPr>
+      <w:rPr>
+        <w:rFonts w:hint="default" w:ascii="Wingdings" w:hAnsi="Wingdings" w:eastAsia="Wingdings" w:cs="Wingdings"/>
       </w:rPr>
       <w:start w:val="1"/>
       <w:suff w:val="tab"/>
@@ -4793,6 +5014,9 @@
   </w:num>
   <w:num w:numId="10">
     <w:abstractNumId w:val="9"/>
+  </w:num>
+  <w:num w:numId="11">
+    <w:abstractNumId w:val="10"/>
   </w:num>
 </w:numbering>
 </file>
@@ -4955,9 +5179,9 @@
     <w:lsdException w:name="Bibliography" w:uiPriority="37"/>
     <w:lsdException w:name="TOC Heading" w:uiPriority="39" w:qFormat="1"/>
   </w:latentStyles>
-  <w:style w:type="table" w:styleId="686">
+  <w:style w:type="table" w:styleId="688">
     <w:name w:val="Table Grid"/>
-    <w:basedOn w:val="862"/>
+    <w:basedOn w:val="864"/>
     <w:uiPriority w:val="59"/>
     <w:pPr>
       <w:pBdr/>
@@ -5154,9 +5378,9 @@
       </w:tcPr>
     </w:tblStylePr>
   </w:style>
-  <w:style w:type="table" w:styleId="687">
+  <w:style w:type="table" w:styleId="689">
     <w:name w:val="Table Grid Light"/>
-    <w:basedOn w:val="862"/>
+    <w:basedOn w:val="864"/>
     <w:uiPriority w:val="59"/>
     <w:pPr>
       <w:pBdr/>
@@ -5353,9 +5577,9 @@
       </w:tcPr>
     </w:tblStylePr>
   </w:style>
-  <w:style w:type="table" w:styleId="688">
+  <w:style w:type="table" w:styleId="690">
     <w:name w:val="Plain Table 1"/>
-    <w:basedOn w:val="862"/>
+    <w:basedOn w:val="864"/>
     <w:uiPriority w:val="59"/>
     <w:pPr>
       <w:pBdr/>
@@ -5578,9 +5802,9 @@
       </w:tcPr>
     </w:tblStylePr>
   </w:style>
-  <w:style w:type="table" w:styleId="689">
+  <w:style w:type="table" w:styleId="691">
     <w:name w:val="Plain Table 2"/>
-    <w:basedOn w:val="862"/>
+    <w:basedOn w:val="864"/>
     <w:uiPriority w:val="59"/>
     <w:pPr>
       <w:pBdr/>
@@ -5811,9 +6035,9 @@
       </w:tcPr>
     </w:tblStylePr>
   </w:style>
-  <w:style w:type="table" w:styleId="690">
+  <w:style w:type="table" w:styleId="692">
     <w:name w:val="Plain Table 3"/>
-    <w:basedOn w:val="862"/>
+    <w:basedOn w:val="864"/>
     <w:uiPriority w:val="99"/>
     <w:pPr>
       <w:pBdr/>
@@ -6041,9 +6265,9 @@
       </w:tcPr>
     </w:tblStylePr>
   </w:style>
-  <w:style w:type="table" w:styleId="691">
+  <w:style w:type="table" w:styleId="693">
     <w:name w:val="Plain Table 4"/>
-    <w:basedOn w:val="862"/>
+    <w:basedOn w:val="864"/>
     <w:uiPriority w:val="99"/>
     <w:pPr>
       <w:pBdr/>
@@ -6257,9 +6481,9 @@
       </w:tcPr>
     </w:tblStylePr>
   </w:style>
-  <w:style w:type="table" w:styleId="692">
+  <w:style w:type="table" w:styleId="694">
     <w:name w:val="Plain Table 5"/>
-    <w:basedOn w:val="862"/>
+    <w:basedOn w:val="864"/>
     <w:uiPriority w:val="99"/>
     <w:pPr>
       <w:pBdr/>
@@ -6490,9 +6714,9 @@
       </w:tcPr>
     </w:tblStylePr>
   </w:style>
-  <w:style w:type="table" w:styleId="693">
+  <w:style w:type="table" w:styleId="695">
     <w:name w:val="Grid Table 1 Light"/>
-    <w:basedOn w:val="862"/>
+    <w:basedOn w:val="864"/>
     <w:uiPriority w:val="99"/>
     <w:pPr>
       <w:pBdr/>
@@ -6713,9 +6937,9 @@
       </w:tcPr>
     </w:tblStylePr>
   </w:style>
-  <w:style w:type="table" w:styleId="694">
+  <w:style w:type="table" w:styleId="696">
     <w:name w:val="Grid Table 1 Light - Accent 1"/>
-    <w:basedOn w:val="862"/>
+    <w:basedOn w:val="864"/>
     <w:uiPriority w:val="99"/>
     <w:pPr>
       <w:pBdr/>
@@ -6936,9 +7160,9 @@
       </w:tcPr>
     </w:tblStylePr>
   </w:style>
-  <w:style w:type="table" w:styleId="695">
+  <w:style w:type="table" w:styleId="697">
     <w:name w:val="Grid Table 1 Light - Accent 2"/>
-    <w:basedOn w:val="862"/>
+    <w:basedOn w:val="864"/>
     <w:uiPriority w:val="99"/>
     <w:pPr>
       <w:pBdr/>
@@ -7159,9 +7383,9 @@
       </w:tcPr>
     </w:tblStylePr>
   </w:style>
-  <w:style w:type="table" w:styleId="696">
+  <w:style w:type="table" w:styleId="698">
     <w:name w:val="Grid Table 1 Light - Accent 3"/>
-    <w:basedOn w:val="862"/>
+    <w:basedOn w:val="864"/>
     <w:uiPriority w:val="99"/>
     <w:pPr>
       <w:pBdr/>
@@ -7382,9 +7606,9 @@
       </w:tcPr>
     </w:tblStylePr>
   </w:style>
-  <w:style w:type="table" w:styleId="697">
+  <w:style w:type="table" w:styleId="699">
     <w:name w:val="Grid Table 1 Light - Accent 4"/>
-    <w:basedOn w:val="862"/>
+    <w:basedOn w:val="864"/>
     <w:uiPriority w:val="99"/>
     <w:pPr>
       <w:pBdr/>
@@ -7605,9 +7829,9 @@
       </w:tcPr>
     </w:tblStylePr>
   </w:style>
-  <w:style w:type="table" w:styleId="698">
+  <w:style w:type="table" w:styleId="700">
     <w:name w:val="Grid Table 1 Light - Accent 5"/>
-    <w:basedOn w:val="862"/>
+    <w:basedOn w:val="864"/>
     <w:uiPriority w:val="99"/>
     <w:pPr>
       <w:pBdr/>
@@ -7828,9 +8052,9 @@
       </w:tcPr>
     </w:tblStylePr>
   </w:style>
-  <w:style w:type="table" w:styleId="699">
+  <w:style w:type="table" w:styleId="701">
     <w:name w:val="Grid Table 1 Light - Accent 6"/>
-    <w:basedOn w:val="862"/>
+    <w:basedOn w:val="864"/>
     <w:uiPriority w:val="99"/>
     <w:pPr>
       <w:pBdr/>
@@ -8051,9 +8275,9 @@
       </w:tcPr>
     </w:tblStylePr>
   </w:style>
-  <w:style w:type="table" w:styleId="700">
+  <w:style w:type="table" w:styleId="702">
     <w:name w:val="Grid Table 2"/>
-    <w:basedOn w:val="862"/>
+    <w:basedOn w:val="864"/>
     <w:uiPriority w:val="99"/>
     <w:pPr>
       <w:pBdr/>
@@ -8283,9 +8507,9 @@
       </w:tcPr>
     </w:tblStylePr>
   </w:style>
-  <w:style w:type="table" w:styleId="701">
+  <w:style w:type="table" w:styleId="703">
     <w:name w:val="Grid Table 2 - Accent 1"/>
-    <w:basedOn w:val="862"/>
+    <w:basedOn w:val="864"/>
     <w:uiPriority w:val="99"/>
     <w:pPr>
       <w:pBdr/>
@@ -8515,9 +8739,9 @@
       </w:tcPr>
     </w:tblStylePr>
   </w:style>
-  <w:style w:type="table" w:styleId="702">
+  <w:style w:type="table" w:styleId="704">
     <w:name w:val="Grid Table 2 - Accent 2"/>
-    <w:basedOn w:val="862"/>
+    <w:basedOn w:val="864"/>
     <w:uiPriority w:val="99"/>
     <w:pPr>
       <w:pBdr/>
@@ -8747,9 +8971,9 @@
       </w:tcPr>
     </w:tblStylePr>
   </w:style>
-  <w:style w:type="table" w:styleId="703">
+  <w:style w:type="table" w:styleId="705">
     <w:name w:val="Grid Table 2 - Accent 3"/>
-    <w:basedOn w:val="862"/>
+    <w:basedOn w:val="864"/>
     <w:uiPriority w:val="99"/>
     <w:pPr>
       <w:pBdr/>
@@ -8979,9 +9203,9 @@
       </w:tcPr>
     </w:tblStylePr>
   </w:style>
-  <w:style w:type="table" w:styleId="704">
+  <w:style w:type="table" w:styleId="706">
     <w:name w:val="Grid Table 2 - Accent 4"/>
-    <w:basedOn w:val="862"/>
+    <w:basedOn w:val="864"/>
     <w:uiPriority w:val="99"/>
     <w:pPr>
       <w:pBdr/>
@@ -9211,9 +9435,9 @@
       </w:tcPr>
     </w:tblStylePr>
   </w:style>
-  <w:style w:type="table" w:styleId="705">
+  <w:style w:type="table" w:styleId="707">
     <w:name w:val="Grid Table 2 - Accent 5"/>
-    <w:basedOn w:val="862"/>
+    <w:basedOn w:val="864"/>
     <w:uiPriority w:val="99"/>
     <w:pPr>
       <w:pBdr/>
@@ -9443,9 +9667,9 @@
       </w:tcPr>
     </w:tblStylePr>
   </w:style>
-  <w:style w:type="table" w:styleId="706">
+  <w:style w:type="table" w:styleId="708">
     <w:name w:val="Grid Table 2 - Accent 6"/>
-    <w:basedOn w:val="862"/>
+    <w:basedOn w:val="864"/>
     <w:uiPriority w:val="99"/>
     <w:pPr>
       <w:pBdr/>
@@ -9675,9 +9899,9 @@
       </w:tcPr>
     </w:tblStylePr>
   </w:style>
-  <w:style w:type="table" w:styleId="707">
+  <w:style w:type="table" w:styleId="709">
     <w:name w:val="Grid Table 3"/>
-    <w:basedOn w:val="862"/>
+    <w:basedOn w:val="864"/>
     <w:uiPriority w:val="99"/>
     <w:pPr>
       <w:pBdr/>
@@ -9920,9 +10144,9 @@
       </w:tcPr>
     </w:tblStylePr>
   </w:style>
-  <w:style w:type="table" w:styleId="708">
+  <w:style w:type="table" w:styleId="710">
     <w:name w:val="Grid Table 3 - Accent 1"/>
-    <w:basedOn w:val="862"/>
+    <w:basedOn w:val="864"/>
     <w:uiPriority w:val="99"/>
     <w:pPr>
       <w:pBdr/>
@@ -10165,9 +10389,9 @@
       </w:tcPr>
     </w:tblStylePr>
   </w:style>
-  <w:style w:type="table" w:styleId="709">
+  <w:style w:type="table" w:styleId="711">
     <w:name w:val="Grid Table 3 - Accent 2"/>
-    <w:basedOn w:val="862"/>
+    <w:basedOn w:val="864"/>
     <w:uiPriority w:val="99"/>
     <w:pPr>
       <w:pBdr/>
@@ -10410,9 +10634,9 @@
       </w:tcPr>
     </w:tblStylePr>
   </w:style>
-  <w:style w:type="table" w:styleId="710">
+  <w:style w:type="table" w:styleId="712">
     <w:name w:val="Grid Table 3 - Accent 3"/>
-    <w:basedOn w:val="862"/>
+    <w:basedOn w:val="864"/>
     <w:uiPriority w:val="99"/>
     <w:pPr>
       <w:pBdr/>
@@ -10655,9 +10879,9 @@
       </w:tcPr>
     </w:tblStylePr>
   </w:style>
-  <w:style w:type="table" w:styleId="711">
+  <w:style w:type="table" w:styleId="713">
     <w:name w:val="Grid Table 3 - Accent 4"/>
-    <w:basedOn w:val="862"/>
+    <w:basedOn w:val="864"/>
     <w:uiPriority w:val="99"/>
     <w:pPr>
       <w:pBdr/>
@@ -10900,9 +11124,9 @@
       </w:tcPr>
     </w:tblStylePr>
   </w:style>
-  <w:style w:type="table" w:styleId="712">
+  <w:style w:type="table" w:styleId="714">
     <w:name w:val="Grid Table 3 - Accent 5"/>
-    <w:basedOn w:val="862"/>
+    <w:basedOn w:val="864"/>
     <w:uiPriority w:val="99"/>
     <w:pPr>
       <w:pBdr/>
@@ -11145,9 +11369,9 @@
       </w:tcPr>
     </w:tblStylePr>
   </w:style>
-  <w:style w:type="table" w:styleId="713">
+  <w:style w:type="table" w:styleId="715">
     <w:name w:val="Grid Table 3 - Accent 6"/>
-    <w:basedOn w:val="862"/>
+    <w:basedOn w:val="864"/>
     <w:uiPriority w:val="99"/>
     <w:pPr>
       <w:pBdr/>
@@ -11390,9 +11614,9 @@
       </w:tcPr>
     </w:tblStylePr>
   </w:style>
-  <w:style w:type="table" w:styleId="714">
+  <w:style w:type="table" w:styleId="716">
     <w:name w:val="Grid Table 4"/>
-    <w:basedOn w:val="862"/>
+    <w:basedOn w:val="864"/>
     <w:uiPriority w:val="59"/>
     <w:pPr>
       <w:pBdr/>
@@ -11623,9 +11847,9 @@
       </w:tcPr>
     </w:tblStylePr>
   </w:style>
-  <w:style w:type="table" w:styleId="715">
+  <w:style w:type="table" w:styleId="717">
     <w:name w:val="Grid Table 4 - Accent 1"/>
-    <w:basedOn w:val="862"/>
+    <w:basedOn w:val="864"/>
     <w:uiPriority w:val="59"/>
     <w:pPr>
       <w:pBdr/>
@@ -11856,9 +12080,9 @@
       </w:tcPr>
     </w:tblStylePr>
   </w:style>
-  <w:style w:type="table" w:styleId="716">
+  <w:style w:type="table" w:styleId="718">
     <w:name w:val="Grid Table 4 - Accent 2"/>
-    <w:basedOn w:val="862"/>
+    <w:basedOn w:val="864"/>
     <w:uiPriority w:val="59"/>
     <w:pPr>
       <w:pBdr/>
@@ -12089,9 +12313,9 @@
       </w:tcPr>
     </w:tblStylePr>
   </w:style>
-  <w:style w:type="table" w:styleId="717">
+  <w:style w:type="table" w:styleId="719">
     <w:name w:val="Grid Table 4 - Accent 3"/>
-    <w:basedOn w:val="862"/>
+    <w:basedOn w:val="864"/>
     <w:uiPriority w:val="59"/>
     <w:pPr>
       <w:pBdr/>
@@ -12322,9 +12546,9 @@
       </w:tcPr>
     </w:tblStylePr>
   </w:style>
-  <w:style w:type="table" w:styleId="718">
+  <w:style w:type="table" w:styleId="720">
     <w:name w:val="Grid Table 4 - Accent 4"/>
-    <w:basedOn w:val="862"/>
+    <w:basedOn w:val="864"/>
     <w:uiPriority w:val="59"/>
     <w:pPr>
       <w:pBdr/>
@@ -12555,9 +12779,9 @@
       </w:tcPr>
     </w:tblStylePr>
   </w:style>
-  <w:style w:type="table" w:styleId="719">
+  <w:style w:type="table" w:styleId="721">
     <w:name w:val="Grid Table 4 - Accent 5"/>
-    <w:basedOn w:val="862"/>
+    <w:basedOn w:val="864"/>
     <w:uiPriority w:val="59"/>
     <w:pPr>
       <w:pBdr/>
@@ -12788,9 +13012,9 @@
       </w:tcPr>
     </w:tblStylePr>
   </w:style>
-  <w:style w:type="table" w:styleId="720">
+  <w:style w:type="table" w:styleId="722">
     <w:name w:val="Grid Table 4 - Accent 6"/>
-    <w:basedOn w:val="862"/>
+    <w:basedOn w:val="864"/>
     <w:uiPriority w:val="59"/>
     <w:pPr>
       <w:pBdr/>
@@ -13021,9 +13245,9 @@
       </w:tcPr>
     </w:tblStylePr>
   </w:style>
-  <w:style w:type="table" w:styleId="721">
+  <w:style w:type="table" w:styleId="723">
     <w:name w:val="Grid Table 5 Dark"/>
-    <w:basedOn w:val="862"/>
+    <w:basedOn w:val="864"/>
     <w:uiPriority w:val="99"/>
     <w:pPr>
       <w:pBdr/>
@@ -13249,9 +13473,9 @@
       </w:tcPr>
     </w:tblStylePr>
   </w:style>
-  <w:style w:type="table" w:styleId="722">
+  <w:style w:type="table" w:styleId="724">
     <w:name w:val="Grid Table 5 Dark- Accent 1"/>
-    <w:basedOn w:val="862"/>
+    <w:basedOn w:val="864"/>
     <w:uiPriority w:val="99"/>
     <w:pPr>
       <w:pBdr/>
@@ -13477,9 +13701,9 @@
       </w:tcPr>
     </w:tblStylePr>
   </w:style>
-  <w:style w:type="table" w:styleId="723">
+  <w:style w:type="table" w:styleId="725">
     <w:name w:val="Grid Table 5 Dark - Accent 2"/>
-    <w:basedOn w:val="862"/>
+    <w:basedOn w:val="864"/>
     <w:uiPriority w:val="99"/>
     <w:pPr>
       <w:pBdr/>
@@ -13705,9 +13929,9 @@
       </w:tcPr>
     </w:tblStylePr>
   </w:style>
-  <w:style w:type="table" w:styleId="724">
+  <w:style w:type="table" w:styleId="726">
     <w:name w:val="Grid Table 5 Dark - Accent 3"/>
-    <w:basedOn w:val="862"/>
+    <w:basedOn w:val="864"/>
     <w:uiPriority w:val="99"/>
     <w:pPr>
       <w:pBdr/>
@@ -13933,9 +14157,9 @@
       </w:tcPr>
     </w:tblStylePr>
   </w:style>
-  <w:style w:type="table" w:styleId="725">
+  <w:style w:type="table" w:styleId="727">
     <w:name w:val="Grid Table 5 Dark- Accent 4"/>
-    <w:basedOn w:val="862"/>
+    <w:basedOn w:val="864"/>
     <w:uiPriority w:val="99"/>
     <w:pPr>
       <w:pBdr/>
@@ -14161,9 +14385,9 @@
       </w:tcPr>
     </w:tblStylePr>
   </w:style>
-  <w:style w:type="table" w:styleId="726">
+  <w:style w:type="table" w:styleId="728">
     <w:name w:val="Grid Table 5 Dark - Accent 5"/>
-    <w:basedOn w:val="862"/>
+    <w:basedOn w:val="864"/>
     <w:uiPriority w:val="99"/>
     <w:pPr>
       <w:pBdr/>
@@ -14389,9 +14613,9 @@
       </w:tcPr>
     </w:tblStylePr>
   </w:style>
-  <w:style w:type="table" w:styleId="727">
+  <w:style w:type="table" w:styleId="729">
     <w:name w:val="Grid Table 5 Dark - Accent 6"/>
-    <w:basedOn w:val="862"/>
+    <w:basedOn w:val="864"/>
     <w:uiPriority w:val="99"/>
     <w:pPr>
       <w:pBdr/>
@@ -14617,9 +14841,9 @@
       </w:tcPr>
     </w:tblStylePr>
   </w:style>
-  <w:style w:type="table" w:styleId="728">
+  <w:style w:type="table" w:styleId="730">
     <w:name w:val="Grid Table 6 Colorful"/>
-    <w:basedOn w:val="862"/>
+    <w:basedOn w:val="864"/>
     <w:uiPriority w:val="99"/>
     <w:pPr>
       <w:pBdr/>
@@ -14847,9 +15071,9 @@
       </w:tcPr>
     </w:tblStylePr>
   </w:style>
-  <w:style w:type="table" w:styleId="729">
+  <w:style w:type="table" w:styleId="731">
     <w:name w:val="Grid Table 6 Colorful - Accent 1"/>
-    <w:basedOn w:val="862"/>
+    <w:basedOn w:val="864"/>
     <w:uiPriority w:val="99"/>
     <w:pPr>
       <w:pBdr/>
@@ -15077,9 +15301,9 @@
       </w:tcPr>
     </w:tblStylePr>
   </w:style>
-  <w:style w:type="table" w:styleId="730">
+  <w:style w:type="table" w:styleId="732">
     <w:name w:val="Grid Table 6 Colorful - Accent 2"/>
-    <w:basedOn w:val="862"/>
+    <w:basedOn w:val="864"/>
     <w:uiPriority w:val="99"/>
     <w:pPr>
       <w:pBdr/>
@@ -15307,9 +15531,9 @@
       </w:tcPr>
     </w:tblStylePr>
   </w:style>
-  <w:style w:type="table" w:styleId="731">
+  <w:style w:type="table" w:styleId="733">
     <w:name w:val="Grid Table 6 Colorful - Accent 3"/>
-    <w:basedOn w:val="862"/>
+    <w:basedOn w:val="864"/>
     <w:uiPriority w:val="99"/>
     <w:pPr>
       <w:pBdr/>
@@ -15537,9 +15761,9 @@
       </w:tcPr>
     </w:tblStylePr>
   </w:style>
-  <w:style w:type="table" w:styleId="732">
+  <w:style w:type="table" w:styleId="734">
     <w:name w:val="Grid Table 6 Colorful - Accent 4"/>
-    <w:basedOn w:val="862"/>
+    <w:basedOn w:val="864"/>
     <w:uiPriority w:val="99"/>
     <w:pPr>
       <w:pBdr/>
@@ -15767,9 +15991,9 @@
       </w:tcPr>
     </w:tblStylePr>
   </w:style>
-  <w:style w:type="table" w:styleId="733">
+  <w:style w:type="table" w:styleId="735">
     <w:name w:val="Grid Table 6 Colorful - Accent 5"/>
-    <w:basedOn w:val="862"/>
+    <w:basedOn w:val="864"/>
     <w:uiPriority w:val="99"/>
     <w:pPr>
       <w:pBdr/>
@@ -15997,9 +16221,9 @@
       </w:tcPr>
     </w:tblStylePr>
   </w:style>
-  <w:style w:type="table" w:styleId="734">
+  <w:style w:type="table" w:styleId="736">
     <w:name w:val="Grid Table 6 Colorful - Accent 6"/>
-    <w:basedOn w:val="862"/>
+    <w:basedOn w:val="864"/>
     <w:uiPriority w:val="99"/>
     <w:pPr>
       <w:pBdr/>
@@ -16227,9 +16451,9 @@
       </w:tcPr>
     </w:tblStylePr>
   </w:style>
-  <w:style w:type="table" w:styleId="735">
+  <w:style w:type="table" w:styleId="737">
     <w:name w:val="Grid Table 7 Colorful"/>
-    <w:basedOn w:val="862"/>
+    <w:basedOn w:val="864"/>
     <w:uiPriority w:val="99"/>
     <w:pPr>
       <w:pBdr/>
@@ -16481,9 +16705,9 @@
       </w:tcPr>
     </w:tblStylePr>
   </w:style>
-  <w:style w:type="table" w:styleId="736">
+  <w:style w:type="table" w:styleId="738">
     <w:name w:val="Grid Table 7 Colorful - Accent 1"/>
-    <w:basedOn w:val="862"/>
+    <w:basedOn w:val="864"/>
     <w:uiPriority w:val="99"/>
     <w:pPr>
       <w:pBdr/>
@@ -16735,9 +16959,9 @@
       </w:tcPr>
     </w:tblStylePr>
   </w:style>
-  <w:style w:type="table" w:styleId="737">
+  <w:style w:type="table" w:styleId="739">
     <w:name w:val="Grid Table 7 Colorful - Accent 2"/>
-    <w:basedOn w:val="862"/>
+    <w:basedOn w:val="864"/>
     <w:uiPriority w:val="99"/>
     <w:pPr>
       <w:pBdr/>
@@ -16989,9 +17213,9 @@
       </w:tcPr>
     </w:tblStylePr>
   </w:style>
-  <w:style w:type="table" w:styleId="738">
+  <w:style w:type="table" w:styleId="740">
     <w:name w:val="Grid Table 7 Colorful - Accent 3"/>
-    <w:basedOn w:val="862"/>
+    <w:basedOn w:val="864"/>
     <w:uiPriority w:val="99"/>
     <w:pPr>
       <w:pBdr/>
@@ -17243,9 +17467,9 @@
       </w:tcPr>
     </w:tblStylePr>
   </w:style>
-  <w:style w:type="table" w:styleId="739">
+  <w:style w:type="table" w:styleId="741">
     <w:name w:val="Grid Table 7 Colorful - Accent 4"/>
-    <w:basedOn w:val="862"/>
+    <w:basedOn w:val="864"/>
     <w:uiPriority w:val="99"/>
     <w:pPr>
       <w:pBdr/>
@@ -17497,9 +17721,9 @@
       </w:tcPr>
     </w:tblStylePr>
   </w:style>
-  <w:style w:type="table" w:styleId="740">
+  <w:style w:type="table" w:styleId="742">
     <w:name w:val="Grid Table 7 Colorful - Accent 5"/>
-    <w:basedOn w:val="862"/>
+    <w:basedOn w:val="864"/>
     <w:uiPriority w:val="99"/>
     <w:pPr>
       <w:pBdr/>
@@ -17751,9 +17975,9 @@
       </w:tcPr>
     </w:tblStylePr>
   </w:style>
-  <w:style w:type="table" w:styleId="741">
+  <w:style w:type="table" w:styleId="743">
     <w:name w:val="Grid Table 7 Colorful - Accent 6"/>
-    <w:basedOn w:val="862"/>
+    <w:basedOn w:val="864"/>
     <w:uiPriority w:val="99"/>
     <w:pPr>
       <w:pBdr/>
@@ -18005,9 +18229,9 @@
       </w:tcPr>
     </w:tblStylePr>
   </w:style>
-  <w:style w:type="table" w:styleId="742">
+  <w:style w:type="table" w:styleId="744">
     <w:name w:val="List Table 1 Light"/>
-    <w:basedOn w:val="862"/>
+    <w:basedOn w:val="864"/>
     <w:uiPriority w:val="99"/>
     <w:pPr>
       <w:pBdr/>
@@ -18221,9 +18445,9 @@
       </w:tcPr>
     </w:tblStylePr>
   </w:style>
-  <w:style w:type="table" w:styleId="743">
+  <w:style w:type="table" w:styleId="745">
     <w:name w:val="List Table 1 Light - Accent 1"/>
-    <w:basedOn w:val="862"/>
+    <w:basedOn w:val="864"/>
     <w:uiPriority w:val="99"/>
     <w:pPr>
       <w:pBdr/>
@@ -18437,9 +18661,9 @@
       </w:tcPr>
     </w:tblStylePr>
   </w:style>
-  <w:style w:type="table" w:styleId="744">
+  <w:style w:type="table" w:styleId="746">
     <w:name w:val="List Table 1 Light - Accent 2"/>
-    <w:basedOn w:val="862"/>
+    <w:basedOn w:val="864"/>
     <w:uiPriority w:val="99"/>
     <w:pPr>
       <w:pBdr/>
@@ -18653,9 +18877,9 @@
       </w:tcPr>
     </w:tblStylePr>
   </w:style>
-  <w:style w:type="table" w:styleId="745">
+  <w:style w:type="table" w:styleId="747">
     <w:name w:val="List Table 1 Light - Accent 3"/>
-    <w:basedOn w:val="862"/>
+    <w:basedOn w:val="864"/>
     <w:uiPriority w:val="99"/>
     <w:pPr>
       <w:pBdr/>
@@ -18869,9 +19093,9 @@
       </w:tcPr>
     </w:tblStylePr>
   </w:style>
-  <w:style w:type="table" w:styleId="746">
+  <w:style w:type="table" w:styleId="748">
     <w:name w:val="List Table 1 Light - Accent 4"/>
-    <w:basedOn w:val="862"/>
+    <w:basedOn w:val="864"/>
     <w:uiPriority w:val="99"/>
     <w:pPr>
       <w:pBdr/>
@@ -19085,9 +19309,9 @@
       </w:tcPr>
     </w:tblStylePr>
   </w:style>
-  <w:style w:type="table" w:styleId="747">
+  <w:style w:type="table" w:styleId="749">
     <w:name w:val="List Table 1 Light - Accent 5"/>
-    <w:basedOn w:val="862"/>
+    <w:basedOn w:val="864"/>
     <w:uiPriority w:val="99"/>
     <w:pPr>
       <w:pBdr/>
@@ -19301,9 +19525,9 @@
       </w:tcPr>
     </w:tblStylePr>
   </w:style>
-  <w:style w:type="table" w:styleId="748">
+  <w:style w:type="table" w:styleId="750">
     <w:name w:val="List Table 1 Light - Accent 6"/>
-    <w:basedOn w:val="862"/>
+    <w:basedOn w:val="864"/>
     <w:uiPriority w:val="99"/>
     <w:pPr>
       <w:pBdr/>
@@ -19517,9 +19741,9 @@
       </w:tcPr>
     </w:tblStylePr>
   </w:style>
-  <w:style w:type="table" w:styleId="749">
+  <w:style w:type="table" w:styleId="751">
     <w:name w:val="List Table 2"/>
-    <w:basedOn w:val="862"/>
+    <w:basedOn w:val="864"/>
     <w:uiPriority w:val="99"/>
     <w:pPr>
       <w:pBdr/>
@@ -19755,9 +19979,9 @@
       </w:tcPr>
     </w:tblStylePr>
   </w:style>
-  <w:style w:type="table" w:styleId="750">
+  <w:style w:type="table" w:styleId="752">
     <w:name w:val="List Table 2 - Accent 1"/>
-    <w:basedOn w:val="862"/>
+    <w:basedOn w:val="864"/>
     <w:uiPriority w:val="99"/>
     <w:pPr>
       <w:pBdr/>
@@ -19993,9 +20217,9 @@
       </w:tcPr>
     </w:tblStylePr>
   </w:style>
-  <w:style w:type="table" w:styleId="751">
+  <w:style w:type="table" w:styleId="753">
     <w:name w:val="List Table 2 - Accent 2"/>
-    <w:basedOn w:val="862"/>
+    <w:basedOn w:val="864"/>
     <w:uiPriority w:val="99"/>
     <w:pPr>
       <w:pBdr/>
@@ -20231,9 +20455,9 @@
       </w:tcPr>
     </w:tblStylePr>
   </w:style>
-  <w:style w:type="table" w:styleId="752">
+  <w:style w:type="table" w:styleId="754">
     <w:name w:val="List Table 2 - Accent 3"/>
-    <w:basedOn w:val="862"/>
+    <w:basedOn w:val="864"/>
     <w:uiPriority w:val="99"/>
     <w:pPr>
       <w:pBdr/>
@@ -20469,9 +20693,9 @@
       </w:tcPr>
     </w:tblStylePr>
   </w:style>
-  <w:style w:type="table" w:styleId="753">
+  <w:style w:type="table" w:styleId="755">
     <w:name w:val="List Table 2 - Accent 4"/>
-    <w:basedOn w:val="862"/>
+    <w:basedOn w:val="864"/>
     <w:uiPriority w:val="99"/>
     <w:pPr>
       <w:pBdr/>
@@ -20707,9 +20931,9 @@
       </w:tcPr>
     </w:tblStylePr>
   </w:style>
-  <w:style w:type="table" w:styleId="754">
+  <w:style w:type="table" w:styleId="756">
     <w:name w:val="List Table 2 - Accent 5"/>
-    <w:basedOn w:val="862"/>
+    <w:basedOn w:val="864"/>
     <w:uiPriority w:val="99"/>
     <w:pPr>
       <w:pBdr/>
@@ -20945,9 +21169,9 @@
       </w:tcPr>
     </w:tblStylePr>
   </w:style>
-  <w:style w:type="table" w:styleId="755">
+  <w:style w:type="table" w:styleId="757">
     <w:name w:val="List Table 2 - Accent 6"/>
-    <w:basedOn w:val="862"/>
+    <w:basedOn w:val="864"/>
     <w:uiPriority w:val="99"/>
     <w:pPr>
       <w:pBdr/>
@@ -21183,9 +21407,9 @@
       </w:tcPr>
     </w:tblStylePr>
   </w:style>
-  <w:style w:type="table" w:styleId="756">
+  <w:style w:type="table" w:styleId="758">
     <w:name w:val="List Table 3"/>
-    <w:basedOn w:val="862"/>
+    <w:basedOn w:val="864"/>
     <w:uiPriority w:val="99"/>
     <w:pPr>
       <w:pBdr/>
@@ -21411,9 +21635,9 @@
       </w:tcPr>
     </w:tblStylePr>
   </w:style>
-  <w:style w:type="table" w:styleId="757">
+  <w:style w:type="table" w:styleId="759">
     <w:name w:val="List Table 3 - Accent 1"/>
-    <w:basedOn w:val="862"/>
+    <w:basedOn w:val="864"/>
     <w:uiPriority w:val="99"/>
     <w:pPr>
       <w:pBdr/>
@@ -21639,9 +21863,9 @@
       </w:tcPr>
     </w:tblStylePr>
   </w:style>
-  <w:style w:type="table" w:styleId="758">
+  <w:style w:type="table" w:styleId="760">
     <w:name w:val="List Table 3 - Accent 2"/>
-    <w:basedOn w:val="862"/>
+    <w:basedOn w:val="864"/>
     <w:uiPriority w:val="99"/>
     <w:pPr>
       <w:pBdr/>
@@ -21867,9 +22091,9 @@
       </w:tcPr>
     </w:tblStylePr>
   </w:style>
-  <w:style w:type="table" w:styleId="759">
+  <w:style w:type="table" w:styleId="761">
     <w:name w:val="List Table 3 - Accent 3"/>
-    <w:basedOn w:val="862"/>
+    <w:basedOn w:val="864"/>
     <w:uiPriority w:val="99"/>
     <w:pPr>
       <w:pBdr/>
@@ -22095,9 +22319,9 @@
       </w:tcPr>
     </w:tblStylePr>
   </w:style>
-  <w:style w:type="table" w:styleId="760">
+  <w:style w:type="table" w:styleId="762">
     <w:name w:val="List Table 3 - Accent 4"/>
-    <w:basedOn w:val="862"/>
+    <w:basedOn w:val="864"/>
     <w:uiPriority w:val="99"/>
     <w:pPr>
       <w:pBdr/>
@@ -22323,9 +22547,9 @@
       </w:tcPr>
     </w:tblStylePr>
   </w:style>
-  <w:style w:type="table" w:styleId="761">
+  <w:style w:type="table" w:styleId="763">
     <w:name w:val="List Table 3 - Accent 5"/>
-    <w:basedOn w:val="862"/>
+    <w:basedOn w:val="864"/>
     <w:uiPriority w:val="99"/>
     <w:pPr>
       <w:pBdr/>
@@ -22551,9 +22775,9 @@
       </w:tcPr>
     </w:tblStylePr>
   </w:style>
-  <w:style w:type="table" w:styleId="762">
+  <w:style w:type="table" w:styleId="764">
     <w:name w:val="List Table 3 - Accent 6"/>
-    <w:basedOn w:val="862"/>
+    <w:basedOn w:val="864"/>
     <w:uiPriority w:val="99"/>
     <w:pPr>
       <w:pBdr/>
@@ -22779,9 +23003,9 @@
       </w:tcPr>
     </w:tblStylePr>
   </w:style>
-  <w:style w:type="table" w:styleId="763">
+  <w:style w:type="table" w:styleId="765">
     <w:name w:val="List Table 4"/>
-    <w:basedOn w:val="862"/>
+    <w:basedOn w:val="864"/>
     <w:uiPriority w:val="99"/>
     <w:pPr>
       <w:pBdr/>
@@ -23004,9 +23228,9 @@
       </w:tcPr>
     </w:tblStylePr>
   </w:style>
-  <w:style w:type="table" w:styleId="764">
+  <w:style w:type="table" w:styleId="766">
     <w:name w:val="List Table 4 - Accent 1"/>
-    <w:basedOn w:val="862"/>
+    <w:basedOn w:val="864"/>
     <w:uiPriority w:val="99"/>
     <w:pPr>
       <w:pBdr/>
@@ -23229,9 +23453,9 @@
       </w:tcPr>
     </w:tblStylePr>
   </w:style>
-  <w:style w:type="table" w:styleId="765">
+  <w:style w:type="table" w:styleId="767">
     <w:name w:val="List Table 4 - Accent 2"/>
-    <w:basedOn w:val="862"/>
+    <w:basedOn w:val="864"/>
     <w:uiPriority w:val="99"/>
     <w:pPr>
       <w:pBdr/>
@@ -23454,9 +23678,9 @@
       </w:tcPr>
     </w:tblStylePr>
   </w:style>
-  <w:style w:type="table" w:styleId="766">
+  <w:style w:type="table" w:styleId="768">
     <w:name w:val="List Table 4 - Accent 3"/>
-    <w:basedOn w:val="862"/>
+    <w:basedOn w:val="864"/>
     <w:uiPriority w:val="99"/>
     <w:pPr>
       <w:pBdr/>
@@ -23679,9 +23903,9 @@
       </w:tcPr>
     </w:tblStylePr>
   </w:style>
-  <w:style w:type="table" w:styleId="767">
+  <w:style w:type="table" w:styleId="769">
     <w:name w:val="List Table 4 - Accent 4"/>
-    <w:basedOn w:val="862"/>
+    <w:basedOn w:val="864"/>
     <w:uiPriority w:val="99"/>
     <w:pPr>
       <w:pBdr/>
@@ -23904,9 +24128,9 @@
       </w:tcPr>
     </w:tblStylePr>
   </w:style>
-  <w:style w:type="table" w:styleId="768">
+  <w:style w:type="table" w:styleId="770">
     <w:name w:val="List Table 4 - Accent 5"/>
-    <w:basedOn w:val="862"/>
+    <w:basedOn w:val="864"/>
     <w:uiPriority w:val="99"/>
     <w:pPr>
       <w:pBdr/>
@@ -24129,9 +24353,9 @@
       </w:tcPr>
     </w:tblStylePr>
   </w:style>
-  <w:style w:type="table" w:styleId="769">
+  <w:style w:type="table" w:styleId="771">
     <w:name w:val="List Table 4 - Accent 6"/>
-    <w:basedOn w:val="862"/>
+    <w:basedOn w:val="864"/>
     <w:uiPriority w:val="99"/>
     <w:pPr>
       <w:pBdr/>
@@ -24354,9 +24578,9 @@
       </w:tcPr>
     </w:tblStylePr>
   </w:style>
-  <w:style w:type="table" w:styleId="770">
+  <w:style w:type="table" w:styleId="772">
     <w:name w:val="List Table 5 Dark"/>
-    <w:basedOn w:val="862"/>
+    <w:basedOn w:val="864"/>
     <w:uiPriority w:val="99"/>
     <w:pPr>
       <w:pBdr/>
@@ -24596,9 +24820,9 @@
       </w:tcPr>
     </w:tblStylePr>
   </w:style>
-  <w:style w:type="table" w:styleId="771">
+  <w:style w:type="table" w:styleId="773">
     <w:name w:val="List Table 5 Dark - Accent 1"/>
-    <w:basedOn w:val="862"/>
+    <w:basedOn w:val="864"/>
     <w:uiPriority w:val="99"/>
     <w:pPr>
       <w:pBdr/>
@@ -24838,9 +25062,9 @@
       </w:tcPr>
     </w:tblStylePr>
   </w:style>
-  <w:style w:type="table" w:styleId="772">
+  <w:style w:type="table" w:styleId="774">
     <w:name w:val="List Table 5 Dark - Accent 2"/>
-    <w:basedOn w:val="862"/>
+    <w:basedOn w:val="864"/>
     <w:uiPriority w:val="99"/>
     <w:pPr>
       <w:pBdr/>
@@ -25080,9 +25304,9 @@
       </w:tcPr>
     </w:tblStylePr>
   </w:style>
-  <w:style w:type="table" w:styleId="773">
+  <w:style w:type="table" w:styleId="775">
     <w:name w:val="List Table 5 Dark - Accent 3"/>
-    <w:basedOn w:val="862"/>
+    <w:basedOn w:val="864"/>
     <w:uiPriority w:val="99"/>
     <w:pPr>
       <w:pBdr/>
@@ -25322,9 +25546,9 @@
       </w:tcPr>
     </w:tblStylePr>
   </w:style>
-  <w:style w:type="table" w:styleId="774">
+  <w:style w:type="table" w:styleId="776">
     <w:name w:val="List Table 5 Dark - Accent 4"/>
-    <w:basedOn w:val="862"/>
+    <w:basedOn w:val="864"/>
     <w:uiPriority w:val="99"/>
     <w:pPr>
       <w:pBdr/>
@@ -25564,9 +25788,9 @@
       </w:tcPr>
     </w:tblStylePr>
   </w:style>
-  <w:style w:type="table" w:styleId="775">
+  <w:style w:type="table" w:styleId="777">
     <w:name w:val="List Table 5 Dark - Accent 5"/>
-    <w:basedOn w:val="862"/>
+    <w:basedOn w:val="864"/>
     <w:uiPriority w:val="99"/>
     <w:pPr>
       <w:pBdr/>
@@ -25806,9 +26030,9 @@
       </w:tcPr>
     </w:tblStylePr>
   </w:style>
-  <w:style w:type="table" w:styleId="776">
+  <w:style w:type="table" w:styleId="778">
     <w:name w:val="List Table 5 Dark - Accent 6"/>
-    <w:basedOn w:val="862"/>
+    <w:basedOn w:val="864"/>
     <w:uiPriority w:val="99"/>
     <w:pPr>
       <w:pBdr/>
@@ -26048,9 +26272,9 @@
       </w:tcPr>
     </w:tblStylePr>
   </w:style>
-  <w:style w:type="table" w:styleId="777">
+  <w:style w:type="table" w:styleId="779">
     <w:name w:val="List Table 6 Colorful"/>
-    <w:basedOn w:val="862"/>
+    <w:basedOn w:val="864"/>
     <w:uiPriority w:val="99"/>
     <w:pPr>
       <w:pBdr/>
@@ -26271,9 +26495,9 @@
       </w:tcPr>
     </w:tblStylePr>
   </w:style>
-  <w:style w:type="table" w:styleId="778">
+  <w:style w:type="table" w:styleId="780">
     <w:name w:val="List Table 6 Colorful - Accent 1"/>
-    <w:basedOn w:val="862"/>
+    <w:basedOn w:val="864"/>
     <w:uiPriority w:val="99"/>
     <w:pPr>
       <w:pBdr/>
@@ -26494,9 +26718,9 @@
       </w:tcPr>
     </w:tblStylePr>
   </w:style>
-  <w:style w:type="table" w:styleId="779">
+  <w:style w:type="table" w:styleId="781">
     <w:name w:val="List Table 6 Colorful - Accent 2"/>
-    <w:basedOn w:val="862"/>
+    <w:basedOn w:val="864"/>
     <w:uiPriority w:val="99"/>
     <w:pPr>
       <w:pBdr/>
@@ -26717,9 +26941,9 @@
       </w:tcPr>
     </w:tblStylePr>
   </w:style>
-  <w:style w:type="table" w:styleId="780">
+  <w:style w:type="table" w:styleId="782">
     <w:name w:val="List Table 6 Colorful - Accent 3"/>
-    <w:basedOn w:val="862"/>
+    <w:basedOn w:val="864"/>
     <w:uiPriority w:val="99"/>
     <w:pPr>
       <w:pBdr/>
@@ -26940,9 +27164,9 @@
       </w:tcPr>
     </w:tblStylePr>
   </w:style>
-  <w:style w:type="table" w:styleId="781">
+  <w:style w:type="table" w:styleId="783">
     <w:name w:val="List Table 6 Colorful - Accent 4"/>
-    <w:basedOn w:val="862"/>
+    <w:basedOn w:val="864"/>
     <w:uiPriority w:val="99"/>
     <w:pPr>
       <w:pBdr/>
@@ -27163,9 +27387,9 @@
       </w:tcPr>
     </w:tblStylePr>
   </w:style>
-  <w:style w:type="table" w:styleId="782">
+  <w:style w:type="table" w:styleId="784">
     <w:name w:val="List Table 6 Colorful - Accent 5"/>
-    <w:basedOn w:val="862"/>
+    <w:basedOn w:val="864"/>
     <w:uiPriority w:val="99"/>
     <w:pPr>
       <w:pBdr/>
@@ -27386,9 +27610,9 @@
       </w:tcPr>
     </w:tblStylePr>
   </w:style>
-  <w:style w:type="table" w:styleId="783">
+  <w:style w:type="table" w:styleId="785">
     <w:name w:val="List Table 6 Colorful - Accent 6"/>
-    <w:basedOn w:val="862"/>
+    <w:basedOn w:val="864"/>
     <w:uiPriority w:val="99"/>
     <w:pPr>
       <w:pBdr/>
@@ -27609,9 +27833,9 @@
       </w:tcPr>
     </w:tblStylePr>
   </w:style>
-  <w:style w:type="table" w:styleId="784">
+  <w:style w:type="table" w:styleId="786">
     <w:name w:val="List Table 7 Colorful"/>
-    <w:basedOn w:val="862"/>
+    <w:basedOn w:val="864"/>
     <w:uiPriority w:val="99"/>
     <w:pPr>
       <w:pBdr/>
@@ -27865,9 +28089,9 @@
       </w:tcPr>
     </w:tblStylePr>
   </w:style>
-  <w:style w:type="table" w:styleId="785">
+  <w:style w:type="table" w:styleId="787">
     <w:name w:val="List Table 7 Colorful - Accent 1"/>
-    <w:basedOn w:val="862"/>
+    <w:basedOn w:val="864"/>
     <w:uiPriority w:val="99"/>
     <w:pPr>
       <w:pBdr/>
@@ -28121,9 +28345,9 @@
       </w:tcPr>
     </w:tblStylePr>
   </w:style>
-  <w:style w:type="table" w:styleId="786">
+  <w:style w:type="table" w:styleId="788">
     <w:name w:val="List Table 7 Colorful - Accent 2"/>
-    <w:basedOn w:val="862"/>
+    <w:basedOn w:val="864"/>
     <w:uiPriority w:val="99"/>
     <w:pPr>
       <w:pBdr/>
@@ -28377,9 +28601,9 @@
       </w:tcPr>
     </w:tblStylePr>
   </w:style>
-  <w:style w:type="table" w:styleId="787">
+  <w:style w:type="table" w:styleId="789">
     <w:name w:val="List Table 7 Colorful - Accent 3"/>
-    <w:basedOn w:val="862"/>
+    <w:basedOn w:val="864"/>
     <w:uiPriority w:val="99"/>
     <w:pPr>
       <w:pBdr/>
@@ -28633,9 +28857,9 @@
       </w:tcPr>
     </w:tblStylePr>
   </w:style>
-  <w:style w:type="table" w:styleId="788">
+  <w:style w:type="table" w:styleId="790">
     <w:name w:val="List Table 7 Colorful - Accent 4"/>
-    <w:basedOn w:val="862"/>
+    <w:basedOn w:val="864"/>
     <w:uiPriority w:val="99"/>
     <w:pPr>
       <w:pBdr/>
@@ -28889,9 +29113,9 @@
       </w:tcPr>
     </w:tblStylePr>
   </w:style>
-  <w:style w:type="table" w:styleId="789">
+  <w:style w:type="table" w:styleId="791">
     <w:name w:val="List Table 7 Colorful - Accent 5"/>
-    <w:basedOn w:val="862"/>
+    <w:basedOn w:val="864"/>
     <w:uiPriority w:val="99"/>
     <w:pPr>
       <w:pBdr/>
@@ -29145,9 +29369,9 @@
       </w:tcPr>
     </w:tblStylePr>
   </w:style>
-  <w:style w:type="table" w:styleId="790">
+  <w:style w:type="table" w:styleId="792">
     <w:name w:val="List Table 7 Colorful - Accent 6"/>
-    <w:basedOn w:val="862"/>
+    <w:basedOn w:val="864"/>
     <w:uiPriority w:val="99"/>
     <w:pPr>
       <w:pBdr/>
@@ -29401,9 +29625,9 @@
       </w:tcPr>
     </w:tblStylePr>
   </w:style>
-  <w:style w:type="table" w:styleId="791">
+  <w:style w:type="table" w:styleId="793">
     <w:name w:val="Lined - Accent"/>
-    <w:basedOn w:val="862"/>
+    <w:basedOn w:val="864"/>
     <w:uiPriority w:val="99"/>
     <w:pPr>
       <w:pBdr/>
@@ -29638,9 +29862,9 @@
       </w:tcPr>
     </w:tblStylePr>
   </w:style>
-  <w:style w:type="table" w:styleId="792">
+  <w:style w:type="table" w:styleId="794">
     <w:name w:val="Lined - Accent 1"/>
-    <w:basedOn w:val="862"/>
+    <w:basedOn w:val="864"/>
     <w:uiPriority w:val="99"/>
     <w:pPr>
       <w:pBdr/>
@@ -29875,9 +30099,9 @@
       </w:tcPr>
     </w:tblStylePr>
   </w:style>
-  <w:style w:type="table" w:styleId="793">
+  <w:style w:type="table" w:styleId="795">
     <w:name w:val="Lined - Accent 2"/>
-    <w:basedOn w:val="862"/>
+    <w:basedOn w:val="864"/>
     <w:uiPriority w:val="99"/>
     <w:pPr>
       <w:pBdr/>
@@ -30112,9 +30336,9 @@
       </w:tcPr>
     </w:tblStylePr>
   </w:style>
-  <w:style w:type="table" w:styleId="794">
+  <w:style w:type="table" w:styleId="796">
     <w:name w:val="Lined - Accent 3"/>
-    <w:basedOn w:val="862"/>
+    <w:basedOn w:val="864"/>
     <w:uiPriority w:val="99"/>
     <w:pPr>
       <w:pBdr/>
@@ -30349,9 +30573,9 @@
       </w:tcPr>
     </w:tblStylePr>
   </w:style>
-  <w:style w:type="table" w:styleId="795">
+  <w:style w:type="table" w:styleId="797">
     <w:name w:val="Lined - Accent 4"/>
-    <w:basedOn w:val="862"/>
+    <w:basedOn w:val="864"/>
     <w:uiPriority w:val="99"/>
     <w:pPr>
       <w:pBdr/>
@@ -30586,9 +30810,9 @@
       </w:tcPr>
     </w:tblStylePr>
   </w:style>
-  <w:style w:type="table" w:styleId="796">
+  <w:style w:type="table" w:styleId="798">
     <w:name w:val="Lined - Accent 5"/>
-    <w:basedOn w:val="862"/>
+    <w:basedOn w:val="864"/>
     <w:uiPriority w:val="99"/>
     <w:pPr>
       <w:pBdr/>
@@ -30823,9 +31047,9 @@
       </w:tcPr>
     </w:tblStylePr>
   </w:style>
-  <w:style w:type="table" w:styleId="797">
+  <w:style w:type="table" w:styleId="799">
     <w:name w:val="Lined - Accent 6"/>
-    <w:basedOn w:val="862"/>
+    <w:basedOn w:val="864"/>
     <w:uiPriority w:val="99"/>
     <w:pPr>
       <w:pBdr/>
@@ -31060,9 +31284,9 @@
       </w:tcPr>
     </w:tblStylePr>
   </w:style>
-  <w:style w:type="table" w:styleId="798">
+  <w:style w:type="table" w:styleId="800">
     <w:name w:val="Bordered &amp; Lined - Accent"/>
-    <w:basedOn w:val="862"/>
+    <w:basedOn w:val="864"/>
     <w:uiPriority w:val="99"/>
     <w:pPr>
       <w:pBdr/>
@@ -31304,9 +31528,9 @@
       </w:tcPr>
     </w:tblStylePr>
   </w:style>
-  <w:style w:type="table" w:styleId="799">
+  <w:style w:type="table" w:styleId="801">
     <w:name w:val="Bordered &amp; Lined - Accent 1"/>
-    <w:basedOn w:val="862"/>
+    <w:basedOn w:val="864"/>
     <w:uiPriority w:val="99"/>
     <w:pPr>
       <w:pBdr/>
@@ -31548,9 +31772,9 @@
       </w:tcPr>
     </w:tblStylePr>
   </w:style>
-  <w:style w:type="table" w:styleId="800">
+  <w:style w:type="table" w:styleId="802">
     <w:name w:val="Bordered &amp; Lined - Accent 2"/>
-    <w:basedOn w:val="862"/>
+    <w:basedOn w:val="864"/>
     <w:uiPriority w:val="99"/>
     <w:pPr>
       <w:pBdr/>
@@ -31792,9 +32016,9 @@
       </w:tcPr>
     </w:tblStylePr>
   </w:style>
-  <w:style w:type="table" w:styleId="801">
+  <w:style w:type="table" w:styleId="803">
     <w:name w:val="Bordered &amp; Lined - Accent 3"/>
-    <w:basedOn w:val="862"/>
+    <w:basedOn w:val="864"/>
     <w:uiPriority w:val="99"/>
     <w:pPr>
       <w:pBdr/>
@@ -32036,9 +32260,9 @@
       </w:tcPr>
     </w:tblStylePr>
   </w:style>
-  <w:style w:type="table" w:styleId="802">
+  <w:style w:type="table" w:styleId="804">
     <w:name w:val="Bordered &amp; Lined - Accent 4"/>
-    <w:basedOn w:val="862"/>
+    <w:basedOn w:val="864"/>
     <w:uiPriority w:val="99"/>
     <w:pPr>
       <w:pBdr/>
@@ -32280,9 +32504,9 @@
       </w:tcPr>
     </w:tblStylePr>
   </w:style>
-  <w:style w:type="table" w:styleId="803">
+  <w:style w:type="table" w:styleId="805">
     <w:name w:val="Bordered &amp; Lined - Accent 5"/>
-    <w:basedOn w:val="862"/>
+    <w:basedOn w:val="864"/>
     <w:uiPriority w:val="99"/>
     <w:pPr>
       <w:pBdr/>
@@ -32524,9 +32748,9 @@
       </w:tcPr>
     </w:tblStylePr>
   </w:style>
-  <w:style w:type="table" w:styleId="804">
+  <w:style w:type="table" w:styleId="806">
     <w:name w:val="Bordered &amp; Lined - Accent 6"/>
-    <w:basedOn w:val="862"/>
+    <w:basedOn w:val="864"/>
     <w:uiPriority w:val="99"/>
     <w:pPr>
       <w:pBdr/>
@@ -32768,9 +32992,9 @@
       </w:tcPr>
     </w:tblStylePr>
   </w:style>
-  <w:style w:type="table" w:styleId="805">
+  <w:style w:type="table" w:styleId="807">
     <w:name w:val="Bordered"/>
-    <w:basedOn w:val="862"/>
+    <w:basedOn w:val="864"/>
     <w:uiPriority w:val="99"/>
     <w:pPr>
       <w:pBdr/>
@@ -32999,9 +33223,9 @@
       </w:tcPr>
     </w:tblStylePr>
   </w:style>
-  <w:style w:type="table" w:styleId="806">
+  <w:style w:type="table" w:styleId="808">
     <w:name w:val="Bordered - Accent 1"/>
-    <w:basedOn w:val="862"/>
+    <w:basedOn w:val="864"/>
     <w:uiPriority w:val="99"/>
     <w:pPr>
       <w:pBdr/>
@@ -33230,9 +33454,9 @@
       </w:tcPr>
     </w:tblStylePr>
   </w:style>
-  <w:style w:type="table" w:styleId="807">
+  <w:style w:type="table" w:styleId="809">
     <w:name w:val="Bordered - Accent 2"/>
-    <w:basedOn w:val="862"/>
+    <w:basedOn w:val="864"/>
     <w:uiPriority w:val="99"/>
     <w:pPr>
       <w:pBdr/>
@@ -33461,9 +33685,9 @@
       </w:tcPr>
     </w:tblStylePr>
   </w:style>
-  <w:style w:type="table" w:styleId="808">
+  <w:style w:type="table" w:styleId="810">
     <w:name w:val="Bordered - Accent 3"/>
-    <w:basedOn w:val="862"/>
+    <w:basedOn w:val="864"/>
     <w:uiPriority w:val="99"/>
     <w:pPr>
       <w:pBdr/>
@@ -33692,9 +33916,9 @@
       </w:tcPr>
     </w:tblStylePr>
   </w:style>
-  <w:style w:type="table" w:styleId="809">
+  <w:style w:type="table" w:styleId="811">
     <w:name w:val="Bordered - Accent 4"/>
-    <w:basedOn w:val="862"/>
+    <w:basedOn w:val="864"/>
     <w:uiPriority w:val="99"/>
     <w:pPr>
       <w:pBdr/>
@@ -33923,9 +34147,9 @@
       </w:tcPr>
     </w:tblStylePr>
   </w:style>
-  <w:style w:type="table" w:styleId="810">
+  <w:style w:type="table" w:styleId="812">
     <w:name w:val="Bordered - Accent 5"/>
-    <w:basedOn w:val="862"/>
+    <w:basedOn w:val="864"/>
     <w:uiPriority w:val="99"/>
     <w:pPr>
       <w:pBdr/>
@@ -34154,9 +34378,9 @@
       </w:tcPr>
     </w:tblStylePr>
   </w:style>
-  <w:style w:type="table" w:styleId="811">
+  <w:style w:type="table" w:styleId="813">
     <w:name w:val="Bordered - Accent 6"/>
-    <w:basedOn w:val="862"/>
+    <w:basedOn w:val="864"/>
     <w:uiPriority w:val="99"/>
     <w:pPr>
       <w:pBdr/>
@@ -34385,11 +34609,11 @@
       </w:tcPr>
     </w:tblStylePr>
   </w:style>
-  <w:style w:type="paragraph" w:styleId="812">
+  <w:style w:type="paragraph" w:styleId="814">
     <w:name w:val="Heading 1"/>
-    <w:basedOn w:val="861"/>
-    <w:next w:val="861"/>
-    <w:link w:val="822"/>
+    <w:basedOn w:val="863"/>
+    <w:next w:val="863"/>
+    <w:link w:val="824"/>
     <w:uiPriority w:val="9"/>
     <w:qFormat/>
     <w:pPr>
@@ -34407,11 +34631,11 @@
       <w:szCs w:val="40"/>
     </w:rPr>
   </w:style>
-  <w:style w:type="paragraph" w:styleId="813">
+  <w:style w:type="paragraph" w:styleId="815">
     <w:name w:val="Heading 2"/>
-    <w:basedOn w:val="861"/>
-    <w:next w:val="861"/>
-    <w:link w:val="823"/>
+    <w:basedOn w:val="863"/>
+    <w:next w:val="863"/>
+    <w:link w:val="825"/>
     <w:uiPriority w:val="9"/>
     <w:unhideWhenUsed/>
     <w:qFormat/>
@@ -34430,11 +34654,11 @@
       <w:szCs w:val="32"/>
     </w:rPr>
   </w:style>
-  <w:style w:type="paragraph" w:styleId="814">
+  <w:style w:type="paragraph" w:styleId="816">
     <w:name w:val="Heading 3"/>
-    <w:basedOn w:val="861"/>
-    <w:next w:val="861"/>
-    <w:link w:val="824"/>
+    <w:basedOn w:val="863"/>
+    <w:next w:val="863"/>
+    <w:link w:val="826"/>
     <w:uiPriority w:val="9"/>
     <w:unhideWhenUsed/>
     <w:qFormat/>
@@ -34453,11 +34677,11 @@
       <w:szCs w:val="28"/>
     </w:rPr>
   </w:style>
-  <w:style w:type="paragraph" w:styleId="815">
+  <w:style w:type="paragraph" w:styleId="817">
     <w:name w:val="Heading 4"/>
-    <w:basedOn w:val="861"/>
-    <w:next w:val="861"/>
-    <w:link w:val="825"/>
+    <w:basedOn w:val="863"/>
+    <w:next w:val="863"/>
+    <w:link w:val="827"/>
     <w:uiPriority w:val="9"/>
     <w:unhideWhenUsed/>
     <w:qFormat/>
@@ -34476,11 +34700,11 @@
       <w:color w:val="0f4761" w:themeColor="accent1" w:themeShade="BF"/>
     </w:rPr>
   </w:style>
-  <w:style w:type="paragraph" w:styleId="816">
+  <w:style w:type="paragraph" w:styleId="818">
     <w:name w:val="Heading 5"/>
-    <w:basedOn w:val="861"/>
-    <w:next w:val="861"/>
-    <w:link w:val="826"/>
+    <w:basedOn w:val="863"/>
+    <w:next w:val="863"/>
+    <w:link w:val="828"/>
     <w:uiPriority w:val="9"/>
     <w:unhideWhenUsed/>
     <w:qFormat/>
@@ -34497,11 +34721,11 @@
       <w:color w:val="0f4761" w:themeColor="accent1" w:themeShade="BF"/>
     </w:rPr>
   </w:style>
-  <w:style w:type="paragraph" w:styleId="817">
+  <w:style w:type="paragraph" w:styleId="819">
     <w:name w:val="Heading 6"/>
-    <w:basedOn w:val="861"/>
-    <w:next w:val="861"/>
-    <w:link w:val="827"/>
+    <w:basedOn w:val="863"/>
+    <w:next w:val="863"/>
+    <w:link w:val="829"/>
     <w:uiPriority w:val="9"/>
     <w:unhideWhenUsed/>
     <w:qFormat/>
@@ -34520,11 +34744,11 @@
       <w:color w:val="595959" w:themeColor="text1" w:themeTint="A6"/>
     </w:rPr>
   </w:style>
-  <w:style w:type="paragraph" w:styleId="818">
+  <w:style w:type="paragraph" w:styleId="820">
     <w:name w:val="Heading 7"/>
-    <w:basedOn w:val="861"/>
-    <w:next w:val="861"/>
-    <w:link w:val="828"/>
+    <w:basedOn w:val="863"/>
+    <w:next w:val="863"/>
+    <w:link w:val="830"/>
     <w:uiPriority w:val="9"/>
     <w:unhideWhenUsed/>
     <w:qFormat/>
@@ -34541,11 +34765,11 @@
       <w:color w:val="595959" w:themeColor="text1" w:themeTint="A6"/>
     </w:rPr>
   </w:style>
-  <w:style w:type="paragraph" w:styleId="819">
+  <w:style w:type="paragraph" w:styleId="821">
     <w:name w:val="Heading 8"/>
-    <w:basedOn w:val="861"/>
-    <w:next w:val="861"/>
-    <w:link w:val="829"/>
+    <w:basedOn w:val="863"/>
+    <w:next w:val="863"/>
+    <w:link w:val="831"/>
     <w:uiPriority w:val="9"/>
     <w:unhideWhenUsed/>
     <w:qFormat/>
@@ -34564,11 +34788,11 @@
       <w:color w:val="272727" w:themeColor="text1" w:themeTint="D8"/>
     </w:rPr>
   </w:style>
-  <w:style w:type="paragraph" w:styleId="820">
+  <w:style w:type="paragraph" w:styleId="822">
     <w:name w:val="Heading 9"/>
-    <w:basedOn w:val="861"/>
-    <w:next w:val="861"/>
-    <w:link w:val="830"/>
+    <w:basedOn w:val="863"/>
+    <w:next w:val="863"/>
+    <w:link w:val="832"/>
     <w:uiPriority w:val="9"/>
     <w:unhideWhenUsed/>
     <w:qFormat/>
@@ -34587,7 +34811,7 @@
       <w:color w:val="272727" w:themeColor="text1" w:themeTint="D8"/>
     </w:rPr>
   </w:style>
-  <w:style w:type="character" w:styleId="821" w:default="1">
+  <w:style w:type="character" w:styleId="823" w:default="1">
     <w:name w:val="Default Paragraph Font"/>
     <w:uiPriority w:val="1"/>
     <w:semiHidden/>
@@ -34598,10 +34822,10 @@
       <w:ind/>
     </w:pPr>
   </w:style>
-  <w:style w:type="character" w:styleId="822">
+  <w:style w:type="character" w:styleId="824">
     <w:name w:val="Heading 1 Char"/>
-    <w:basedOn w:val="821"/>
-    <w:link w:val="812"/>
+    <w:basedOn w:val="823"/>
+    <w:link w:val="814"/>
     <w:uiPriority w:val="9"/>
     <w:pPr>
       <w:pBdr/>
@@ -34615,10 +34839,10 @@
       <w:szCs w:val="40"/>
     </w:rPr>
   </w:style>
-  <w:style w:type="character" w:styleId="823">
+  <w:style w:type="character" w:styleId="825">
     <w:name w:val="Heading 2 Char"/>
-    <w:basedOn w:val="821"/>
-    <w:link w:val="813"/>
+    <w:basedOn w:val="823"/>
+    <w:link w:val="815"/>
     <w:uiPriority w:val="9"/>
     <w:pPr>
       <w:pBdr/>
@@ -34632,10 +34856,10 @@
       <w:szCs w:val="32"/>
     </w:rPr>
   </w:style>
-  <w:style w:type="character" w:styleId="824">
+  <w:style w:type="character" w:styleId="826">
     <w:name w:val="Heading 3 Char"/>
-    <w:basedOn w:val="821"/>
-    <w:link w:val="814"/>
+    <w:basedOn w:val="823"/>
+    <w:link w:val="816"/>
     <w:uiPriority w:val="9"/>
     <w:pPr>
       <w:pBdr/>
@@ -34649,10 +34873,10 @@
       <w:szCs w:val="28"/>
     </w:rPr>
   </w:style>
-  <w:style w:type="character" w:styleId="825">
+  <w:style w:type="character" w:styleId="827">
     <w:name w:val="Heading 4 Char"/>
-    <w:basedOn w:val="821"/>
-    <w:link w:val="815"/>
+    <w:basedOn w:val="823"/>
+    <w:link w:val="817"/>
     <w:uiPriority w:val="9"/>
     <w:pPr>
       <w:pBdr/>
@@ -34666,10 +34890,10 @@
       <w:color w:val="0f4761" w:themeColor="accent1" w:themeShade="BF"/>
     </w:rPr>
   </w:style>
-  <w:style w:type="character" w:styleId="826">
+  <w:style w:type="character" w:styleId="828">
     <w:name w:val="Heading 5 Char"/>
-    <w:basedOn w:val="821"/>
-    <w:link w:val="816"/>
+    <w:basedOn w:val="823"/>
+    <w:link w:val="818"/>
     <w:uiPriority w:val="9"/>
     <w:pPr>
       <w:pBdr/>
@@ -34681,10 +34905,10 @@
       <w:color w:val="0f4761" w:themeColor="accent1" w:themeShade="BF"/>
     </w:rPr>
   </w:style>
-  <w:style w:type="character" w:styleId="827">
+  <w:style w:type="character" w:styleId="829">
     <w:name w:val="Heading 6 Char"/>
-    <w:basedOn w:val="821"/>
-    <w:link w:val="817"/>
+    <w:basedOn w:val="823"/>
+    <w:link w:val="819"/>
     <w:uiPriority w:val="9"/>
     <w:pPr>
       <w:pBdr/>
@@ -34698,10 +34922,10 @@
       <w:color w:val="595959" w:themeColor="text1" w:themeTint="A6"/>
     </w:rPr>
   </w:style>
-  <w:style w:type="character" w:styleId="828">
+  <w:style w:type="character" w:styleId="830">
     <w:name w:val="Heading 7 Char"/>
-    <w:basedOn w:val="821"/>
-    <w:link w:val="818"/>
+    <w:basedOn w:val="823"/>
+    <w:link w:val="820"/>
     <w:uiPriority w:val="9"/>
     <w:pPr>
       <w:pBdr/>
@@ -34713,10 +34937,10 @@
       <w:color w:val="595959" w:themeColor="text1" w:themeTint="A6"/>
     </w:rPr>
   </w:style>
-  <w:style w:type="character" w:styleId="829">
+  <w:style w:type="character" w:styleId="831">
     <w:name w:val="Heading 8 Char"/>
-    <w:basedOn w:val="821"/>
-    <w:link w:val="819"/>
+    <w:basedOn w:val="823"/>
+    <w:link w:val="821"/>
     <w:uiPriority w:val="9"/>
     <w:pPr>
       <w:pBdr/>
@@ -34730,10 +34954,10 @@
       <w:color w:val="272727" w:themeColor="text1" w:themeTint="D8"/>
     </w:rPr>
   </w:style>
-  <w:style w:type="character" w:styleId="830">
+  <w:style w:type="character" w:styleId="832">
     <w:name w:val="Heading 9 Char"/>
-    <w:basedOn w:val="821"/>
-    <w:link w:val="820"/>
+    <w:basedOn w:val="823"/>
+    <w:link w:val="822"/>
     <w:uiPriority w:val="9"/>
     <w:pPr>
       <w:pBdr/>
@@ -34747,11 +34971,11 @@
       <w:color w:val="272727" w:themeColor="text1" w:themeTint="D8"/>
     </w:rPr>
   </w:style>
-  <w:style w:type="paragraph" w:styleId="831">
+  <w:style w:type="paragraph" w:styleId="833">
     <w:name w:val="Title"/>
-    <w:basedOn w:val="861"/>
-    <w:next w:val="861"/>
-    <w:link w:val="832"/>
+    <w:basedOn w:val="863"/>
+    <w:next w:val="863"/>
+    <w:link w:val="834"/>
     <w:uiPriority w:val="10"/>
     <w:qFormat/>
     <w:pPr>
@@ -34767,10 +34991,10 @@
       <w:szCs w:val="56"/>
     </w:rPr>
   </w:style>
-  <w:style w:type="character" w:styleId="832">
+  <w:style w:type="character" w:styleId="834">
     <w:name w:val="Title Char"/>
-    <w:basedOn w:val="821"/>
-    <w:link w:val="831"/>
+    <w:basedOn w:val="823"/>
+    <w:link w:val="833"/>
     <w:uiPriority w:val="10"/>
     <w:pPr>
       <w:pBdr/>
@@ -34784,11 +35008,11 @@
       <w:szCs w:val="56"/>
     </w:rPr>
   </w:style>
-  <w:style w:type="paragraph" w:styleId="833">
+  <w:style w:type="paragraph" w:styleId="835">
     <w:name w:val="Subtitle"/>
-    <w:basedOn w:val="861"/>
-    <w:next w:val="861"/>
-    <w:link w:val="834"/>
+    <w:basedOn w:val="863"/>
+    <w:next w:val="863"/>
+    <w:link w:val="836"/>
     <w:uiPriority w:val="11"/>
     <w:qFormat/>
     <w:pPr>
@@ -34806,10 +35030,10 @@
       <w:szCs w:val="28"/>
     </w:rPr>
   </w:style>
-  <w:style w:type="character" w:styleId="834">
+  <w:style w:type="character" w:styleId="836">
     <w:name w:val="Subtitle Char"/>
-    <w:basedOn w:val="821"/>
-    <w:link w:val="833"/>
+    <w:basedOn w:val="823"/>
+    <w:link w:val="835"/>
     <w:uiPriority w:val="11"/>
     <w:pPr>
       <w:pBdr/>
@@ -34823,11 +35047,11 @@
       <w:szCs w:val="28"/>
     </w:rPr>
   </w:style>
-  <w:style w:type="paragraph" w:styleId="835">
+  <w:style w:type="paragraph" w:styleId="837">
     <w:name w:val="Quote"/>
-    <w:basedOn w:val="861"/>
-    <w:next w:val="861"/>
-    <w:link w:val="836"/>
+    <w:basedOn w:val="863"/>
+    <w:next w:val="863"/>
+    <w:link w:val="838"/>
     <w:uiPriority w:val="29"/>
     <w:qFormat/>
     <w:pPr>
@@ -34842,10 +35066,10 @@
       <w:color w:val="404040" w:themeColor="text1" w:themeTint="BF"/>
     </w:rPr>
   </w:style>
-  <w:style w:type="character" w:styleId="836">
+  <w:style w:type="character" w:styleId="838">
     <w:name w:val="Quote Char"/>
-    <w:basedOn w:val="821"/>
-    <w:link w:val="835"/>
+    <w:basedOn w:val="823"/>
+    <w:link w:val="837"/>
     <w:uiPriority w:val="29"/>
     <w:pPr>
       <w:pBdr/>
@@ -34858,9 +35082,9 @@
       <w:color w:val="404040" w:themeColor="text1" w:themeTint="BF"/>
     </w:rPr>
   </w:style>
-  <w:style w:type="character" w:styleId="837">
+  <w:style w:type="character" w:styleId="839">
     <w:name w:val="Intense Emphasis"/>
-    <w:basedOn w:val="821"/>
+    <w:basedOn w:val="823"/>
     <w:uiPriority w:val="21"/>
     <w:qFormat/>
     <w:pPr>
@@ -34874,11 +35098,11 @@
       <w:color w:val="0f4761" w:themeColor="accent1" w:themeShade="BF"/>
     </w:rPr>
   </w:style>
-  <w:style w:type="paragraph" w:styleId="838">
+  <w:style w:type="paragraph" w:styleId="840">
     <w:name w:val="Intense Quote"/>
-    <w:basedOn w:val="861"/>
-    <w:next w:val="861"/>
-    <w:link w:val="839"/>
+    <w:basedOn w:val="863"/>
+    <w:next w:val="863"/>
+    <w:link w:val="841"/>
     <w:uiPriority w:val="30"/>
     <w:qFormat/>
     <w:pPr>
@@ -34896,10 +35120,10 @@
       <w:color w:val="0f4761" w:themeColor="accent1" w:themeShade="BF"/>
     </w:rPr>
   </w:style>
-  <w:style w:type="character" w:styleId="839">
+  <w:style w:type="character" w:styleId="841">
     <w:name w:val="Intense Quote Char"/>
-    <w:basedOn w:val="821"/>
-    <w:link w:val="838"/>
+    <w:basedOn w:val="823"/>
+    <w:link w:val="840"/>
     <w:uiPriority w:val="30"/>
     <w:pPr>
       <w:pBdr/>
@@ -34912,9 +35136,9 @@
       <w:color w:val="0f4761" w:themeColor="accent1" w:themeShade="BF"/>
     </w:rPr>
   </w:style>
-  <w:style w:type="character" w:styleId="840">
+  <w:style w:type="character" w:styleId="842">
     <w:name w:val="Intense Reference"/>
-    <w:basedOn w:val="821"/>
+    <w:basedOn w:val="823"/>
     <w:uiPriority w:val="32"/>
     <w:qFormat/>
     <w:pPr>
@@ -34930,9 +35154,9 @@
       <w:spacing w:val="5"/>
     </w:rPr>
   </w:style>
-  <w:style w:type="character" w:styleId="841">
+  <w:style w:type="character" w:styleId="843">
     <w:name w:val="Subtle Emphasis"/>
-    <w:basedOn w:val="821"/>
+    <w:basedOn w:val="823"/>
     <w:uiPriority w:val="19"/>
     <w:qFormat/>
     <w:pPr>
@@ -34946,9 +35170,9 @@
       <w:color w:val="404040" w:themeColor="text1" w:themeTint="BF"/>
     </w:rPr>
   </w:style>
-  <w:style w:type="character" w:styleId="842">
+  <w:style w:type="character" w:styleId="844">
     <w:name w:val="Emphasis"/>
-    <w:basedOn w:val="821"/>
+    <w:basedOn w:val="823"/>
     <w:uiPriority w:val="20"/>
     <w:qFormat/>
     <w:pPr>
@@ -34961,9 +35185,9 @@
       <w:iCs/>
     </w:rPr>
   </w:style>
-  <w:style w:type="character" w:styleId="843">
+  <w:style w:type="character" w:styleId="845">
     <w:name w:val="Strong"/>
-    <w:basedOn w:val="821"/>
+    <w:basedOn w:val="823"/>
     <w:uiPriority w:val="22"/>
     <w:qFormat/>
     <w:pPr>
@@ -34976,9 +35200,9 @@
       <w:bCs/>
     </w:rPr>
   </w:style>
-  <w:style w:type="character" w:styleId="844">
+  <w:style w:type="character" w:styleId="846">
     <w:name w:val="Subtle Reference"/>
-    <w:basedOn w:val="821"/>
+    <w:basedOn w:val="823"/>
     <w:uiPriority w:val="31"/>
     <w:qFormat/>
     <w:pPr>
@@ -34991,9 +35215,9 @@
       <w:color w:val="5a5a5a" w:themeColor="text1" w:themeTint="A5"/>
     </w:rPr>
   </w:style>
-  <w:style w:type="character" w:styleId="845">
+  <w:style w:type="character" w:styleId="847">
     <w:name w:val="Book Title"/>
-    <w:basedOn w:val="821"/>
+    <w:basedOn w:val="823"/>
     <w:uiPriority w:val="33"/>
     <w:qFormat/>
     <w:pPr>
@@ -35009,36 +35233,9 @@
       <w:spacing w:val="5"/>
     </w:rPr>
   </w:style>
-  <w:style w:type="paragraph" w:styleId="846">
+  <w:style w:type="paragraph" w:styleId="848">
     <w:name w:val="Header"/>
-    <w:basedOn w:val="861"/>
-    <w:link w:val="847"/>
-    <w:uiPriority w:val="99"/>
-    <w:unhideWhenUsed/>
-    <w:pPr>
-      <w:pBdr/>
-      <w:tabs>
-        <w:tab w:val="bar" w:leader="none" w:pos="4844"/>
-        <w:tab w:val="bar" w:leader="none" w:pos="9689"/>
-      </w:tabs>
-      <w:spacing w:after="0" w:line="240" w:lineRule="auto"/>
-      <w:ind/>
-    </w:pPr>
-  </w:style>
-  <w:style w:type="character" w:styleId="847">
-    <w:name w:val="Header Char"/>
-    <w:basedOn w:val="821"/>
-    <w:link w:val="846"/>
-    <w:uiPriority w:val="99"/>
-    <w:pPr>
-      <w:pBdr/>
-      <w:spacing/>
-      <w:ind/>
-    </w:pPr>
-  </w:style>
-  <w:style w:type="paragraph" w:styleId="848">
-    <w:name w:val="Footer"/>
-    <w:basedOn w:val="861"/>
+    <w:basedOn w:val="863"/>
     <w:link w:val="849"/>
     <w:uiPriority w:val="99"/>
     <w:unhideWhenUsed/>
@@ -35053,8 +35250,8 @@
     </w:pPr>
   </w:style>
   <w:style w:type="character" w:styleId="849">
-    <w:name w:val="Footer Char"/>
-    <w:basedOn w:val="821"/>
+    <w:name w:val="Header Char"/>
+    <w:basedOn w:val="823"/>
     <w:link w:val="848"/>
     <w:uiPriority w:val="99"/>
     <w:pPr>
@@ -35064,9 +35261,36 @@
     </w:pPr>
   </w:style>
   <w:style w:type="paragraph" w:styleId="850">
+    <w:name w:val="Footer"/>
+    <w:basedOn w:val="863"/>
+    <w:link w:val="851"/>
+    <w:uiPriority w:val="99"/>
+    <w:unhideWhenUsed/>
+    <w:pPr>
+      <w:pBdr/>
+      <w:tabs>
+        <w:tab w:val="bar" w:leader="none" w:pos="4844"/>
+        <w:tab w:val="bar" w:leader="none" w:pos="9689"/>
+      </w:tabs>
+      <w:spacing w:after="0" w:line="240" w:lineRule="auto"/>
+      <w:ind/>
+    </w:pPr>
+  </w:style>
+  <w:style w:type="character" w:styleId="851">
+    <w:name w:val="Footer Char"/>
+    <w:basedOn w:val="823"/>
+    <w:link w:val="850"/>
+    <w:uiPriority w:val="99"/>
+    <w:pPr>
+      <w:pBdr/>
+      <w:spacing/>
+      <w:ind/>
+    </w:pPr>
+  </w:style>
+  <w:style w:type="paragraph" w:styleId="852">
     <w:name w:val="Caption"/>
-    <w:basedOn w:val="861"/>
-    <w:next w:val="861"/>
+    <w:basedOn w:val="863"/>
+    <w:next w:val="863"/>
     <w:uiPriority w:val="35"/>
     <w:unhideWhenUsed/>
     <w:qFormat/>
@@ -35083,10 +35307,10 @@
       <w:szCs w:val="18"/>
     </w:rPr>
   </w:style>
-  <w:style w:type="paragraph" w:styleId="851">
+  <w:style w:type="paragraph" w:styleId="853">
     <w:name w:val="footnote text"/>
-    <w:basedOn w:val="861"/>
-    <w:link w:val="852"/>
+    <w:basedOn w:val="863"/>
+    <w:link w:val="854"/>
     <w:uiPriority w:val="99"/>
     <w:semiHidden/>
     <w:unhideWhenUsed/>
@@ -35100,10 +35324,10 @@
       <w:szCs w:val="20"/>
     </w:rPr>
   </w:style>
-  <w:style w:type="character" w:styleId="852">
+  <w:style w:type="character" w:styleId="854">
     <w:name w:val="Footnote Text Char"/>
-    <w:basedOn w:val="821"/>
-    <w:link w:val="851"/>
+    <w:basedOn w:val="823"/>
+    <w:link w:val="853"/>
     <w:uiPriority w:val="99"/>
     <w:semiHidden/>
     <w:pPr>
@@ -35116,9 +35340,9 @@
       <w:szCs w:val="20"/>
     </w:rPr>
   </w:style>
-  <w:style w:type="character" w:styleId="853">
+  <w:style w:type="character" w:styleId="855">
     <w:name w:val="footnote reference"/>
-    <w:basedOn w:val="821"/>
+    <w:basedOn w:val="823"/>
     <w:uiPriority w:val="99"/>
     <w:semiHidden/>
     <w:unhideWhenUsed/>
@@ -35131,10 +35355,10 @@
       <w:vertAlign w:val="superscript"/>
     </w:rPr>
   </w:style>
-  <w:style w:type="paragraph" w:styleId="854">
+  <w:style w:type="paragraph" w:styleId="856">
     <w:name w:val="endnote text"/>
-    <w:basedOn w:val="861"/>
-    <w:link w:val="855"/>
+    <w:basedOn w:val="863"/>
+    <w:link w:val="857"/>
     <w:uiPriority w:val="99"/>
     <w:semiHidden/>
     <w:unhideWhenUsed/>
@@ -35148,10 +35372,10 @@
       <w:szCs w:val="20"/>
     </w:rPr>
   </w:style>
-  <w:style w:type="character" w:styleId="855">
+  <w:style w:type="character" w:styleId="857">
     <w:name w:val="Endnote Text Char"/>
-    <w:basedOn w:val="821"/>
-    <w:link w:val="854"/>
+    <w:basedOn w:val="823"/>
+    <w:link w:val="856"/>
     <w:uiPriority w:val="99"/>
     <w:semiHidden/>
     <w:pPr>
@@ -35164,9 +35388,9 @@
       <w:szCs w:val="20"/>
     </w:rPr>
   </w:style>
-  <w:style w:type="character" w:styleId="856">
+  <w:style w:type="character" w:styleId="858">
     <w:name w:val="endnote reference"/>
-    <w:basedOn w:val="821"/>
+    <w:basedOn w:val="823"/>
     <w:uiPriority w:val="99"/>
     <w:semiHidden/>
     <w:unhideWhenUsed/>
@@ -35179,9 +35403,9 @@
       <w:vertAlign w:val="superscript"/>
     </w:rPr>
   </w:style>
-  <w:style w:type="character" w:styleId="857">
+  <w:style w:type="character" w:styleId="859">
     <w:name w:val="Hyperlink"/>
-    <w:basedOn w:val="821"/>
+    <w:basedOn w:val="823"/>
     <w:uiPriority w:val="99"/>
     <w:unhideWhenUsed/>
     <w:pPr>
@@ -35194,9 +35418,9 @@
       <w:u w:val="single"/>
     </w:rPr>
   </w:style>
-  <w:style w:type="character" w:styleId="858">
+  <w:style w:type="character" w:styleId="860">
     <w:name w:val="FollowedHyperlink"/>
-    <w:basedOn w:val="821"/>
+    <w:basedOn w:val="823"/>
     <w:uiPriority w:val="99"/>
     <w:semiHidden/>
     <w:unhideWhenUsed/>
@@ -35210,7 +35434,7 @@
       <w:u w:val="single"/>
     </w:rPr>
   </w:style>
-  <w:style w:type="paragraph" w:styleId="859">
+  <w:style w:type="paragraph" w:styleId="861">
     <w:name w:val="TOC Heading"/>
     <w:uiPriority w:val="39"/>
     <w:unhideWhenUsed/>
@@ -35220,10 +35444,10 @@
       <w:ind/>
     </w:pPr>
   </w:style>
-  <w:style w:type="paragraph" w:styleId="860">
+  <w:style w:type="paragraph" w:styleId="862">
     <w:name w:val="table of figures"/>
-    <w:basedOn w:val="861"/>
-    <w:next w:val="861"/>
+    <w:basedOn w:val="863"/>
+    <w:next w:val="863"/>
     <w:uiPriority w:val="99"/>
     <w:unhideWhenUsed/>
     <w:pPr>
@@ -35232,7 +35456,7 @@
       <w:ind/>
     </w:pPr>
   </w:style>
-  <w:style w:type="paragraph" w:styleId="861" w:default="1">
+  <w:style w:type="paragraph" w:styleId="863" w:default="1">
     <w:name w:val="Normal"/>
     <w:qFormat/>
     <w:pPr>
@@ -35241,7 +35465,7 @@
       <w:ind/>
     </w:pPr>
   </w:style>
-  <w:style w:type="table" w:styleId="862" w:default="1">
+  <w:style w:type="table" w:styleId="864" w:default="1">
     <w:name w:val="Normal Table"/>
     <w:uiPriority w:val="99"/>
     <w:semiHidden/>
@@ -35434,7 +35658,7 @@
       </w:tcPr>
     </w:tblStylePr>
   </w:style>
-  <w:style w:type="numbering" w:styleId="863" w:default="1">
+  <w:style w:type="numbering" w:styleId="865" w:default="1">
     <w:name w:val="No List"/>
     <w:uiPriority w:val="99"/>
     <w:semiHidden/>
@@ -35445,9 +35669,9 @@
       <w:ind/>
     </w:pPr>
   </w:style>
-  <w:style w:type="paragraph" w:styleId="864">
+  <w:style w:type="paragraph" w:styleId="866">
     <w:name w:val="No Spacing"/>
-    <w:basedOn w:val="861"/>
+    <w:basedOn w:val="863"/>
     <w:uiPriority w:val="1"/>
     <w:qFormat/>
     <w:pPr>
@@ -35456,9 +35680,9 @@
       <w:ind/>
     </w:pPr>
   </w:style>
-  <w:style w:type="paragraph" w:styleId="865">
+  <w:style w:type="paragraph" w:styleId="867">
     <w:name w:val="List Paragraph"/>
-    <w:basedOn w:val="861"/>
+    <w:basedOn w:val="863"/>
     <w:uiPriority w:val="34"/>
     <w:qFormat/>
     <w:pPr>

</xml_diff>